<commit_message>
Correction: test env uses real un-anonymised data; add team-of-three working model
- Guide §2/§7/M6 + readiness SEC-2: MITA has no anonymisation tool yet, so the test environment holds
  real Restricted data. Reframed as a HIGHER bar (DPIA must cover test, named least-privilege access,
  audit logging, treat env as Restricted, record as a constraint with anonymisation as remediation),
  not a relaxation.
- Guide §9: how three developers split work (vertical ownership, one owner for the shared core,
  PR review + CI as the consistency backbone) while keeping outputs consistent.
- Regenerated the Developers Guide .docx; repackaged the production-readiness-check skill + plugin.
</commit_message>
<xml_diff>
--- a/docs/MTCA_DataPlatform_Developers_Guide.docx
+++ b/docs/MTCA_DataPlatform_Developers_Guide.docx
@@ -635,19 +635,91 @@
         <w:rPr>
           <w:b/>
         </w:rPr>
-        <w:t xml:space="preserve">Anonymised dev databases</w:t>
-      </w:r>
-      <w:r>
-        <w:t xml:space="preserve"> </w:t>
-      </w:r>
-      <w:r>
-        <w:t xml:space="preserve">for development (real Restricted data is gated by the DPO’s DPIA — see</w:t>
-      </w:r>
-      <w:r>
-        <w:t xml:space="preserve"> </w:t>
-      </w:r>
-      <w:r>
-        <w:t xml:space="preserve">§7).</w:t>
+        <w:t xml:space="preserve">Test environment with real data.</w:t>
+      </w:r>
+      <w:r>
+        <w:t xml:space="preserve"> </w:t>
+      </w:r>
+      <w:r>
+        <w:t xml:space="preserve">MITA does not yet have an anonymisation/pseudonymisation</w:t>
+      </w:r>
+      <w:r>
+        <w:t xml:space="preserve"> </w:t>
+      </w:r>
+      <w:r>
+        <w:t xml:space="preserve">capability, so the test environment you develop against holds</w:t>
+      </w:r>
+      <w:r>
+        <w:t xml:space="preserve"> </w:t>
+      </w:r>
+      <w:r>
+        <w:rPr>
+          <w:b/>
+        </w:rPr>
+        <w:t xml:space="preserve">real, un-anonymised Restricted</w:t>
+      </w:r>
+      <w:r>
+        <w:rPr>
+          <w:b/>
+        </w:rPr>
+        <w:t xml:space="preserve"> </w:t>
+      </w:r>
+      <w:r>
+        <w:rPr>
+          <w:b/>
+        </w:rPr>
+        <w:t xml:space="preserve">data</w:t>
+      </w:r>
+      <w:r>
+        <w:t xml:space="preserve">. This</w:t>
+      </w:r>
+      <w:r>
+        <w:t xml:space="preserve"> </w:t>
+      </w:r>
+      <w:r>
+        <w:rPr>
+          <w:i/>
+        </w:rPr>
+        <w:t xml:space="preserve">raises</w:t>
+      </w:r>
+      <w:r>
+        <w:t xml:space="preserve"> </w:t>
+      </w:r>
+      <w:r>
+        <w:t xml:space="preserve">the data-protection bar, it does not lower it — see the data-handling note</w:t>
+      </w:r>
+      <w:r>
+        <w:t xml:space="preserve"> </w:t>
+      </w:r>
+      <w:r>
+        <w:t xml:space="preserve">in §7.</w:t>
+      </w:r>
+      <w:r>
+        <w:t xml:space="preserve"> </w:t>
+      </w:r>
+      <w:r>
+        <w:rPr>
+          <w:b/>
+        </w:rPr>
+        <w:t xml:space="preserve">Do not start against real data until the DPO has approved its use in the test</w:t>
+      </w:r>
+      <w:r>
+        <w:rPr>
+          <w:b/>
+        </w:rPr>
+        <w:t xml:space="preserve"> </w:t>
+      </w:r>
+      <w:r>
+        <w:rPr>
+          <w:b/>
+        </w:rPr>
+        <w:t xml:space="preserve">environment</w:t>
+      </w:r>
+      <w:r>
+        <w:t xml:space="preserve"> </w:t>
+      </w:r>
+      <w:r>
+        <w:t xml:space="preserve">(the DPIA must cover test, not only production).</w:t>
       </w:r>
     </w:p>
     <w:p>
@@ -4695,7 +4767,13 @@
         <w:t xml:space="preserve"> </w:t>
       </w:r>
       <w:r>
-        <w:t xml:space="preserve">sign-off, obtain the DPIA clearance for moving from anonymised dev data to real Restricted data.</w:t>
+        <w:t xml:space="preserve">sign-off. (The DPIA covering real data — used in both test and production — should already be</w:t>
+      </w:r>
+      <w:r>
+        <w:t xml:space="preserve"> </w:t>
+      </w:r>
+      <w:r>
+        <w:t xml:space="preserve">approved per §7; confirm it here.)</w:t>
       </w:r>
     </w:p>
     <w:p>
@@ -5249,61 +5327,253 @@
         <w:rPr>
           <w:b/>
         </w:rPr>
-        <w:t xml:space="preserve">Security &amp; data protection.</w:t>
-      </w:r>
-      <w:r>
-        <w:t xml:space="preserve"> </w:t>
-      </w:r>
-      <w:r>
-        <w:t xml:space="preserve">Restricted-by-default; classification cascades; access via Keycloak</w:t>
-      </w:r>
-      <w:r>
-        <w:t xml:space="preserve"> </w:t>
-      </w:r>
-      <w:r>
-        <w:t xml:space="preserve">RBAC.</w:t>
-      </w:r>
-      <w:r>
-        <w:t xml:space="preserve"> </w:t>
-      </w:r>
-      <w:r>
-        <w:rPr>
-          <w:b/>
-        </w:rPr>
-        <w:t xml:space="preserve">Real Restricted data may not be processed until the DPO’s DPIA clears it</w:t>
-      </w:r>
-      <w:r>
-        <w:t xml:space="preserve"> </w:t>
-      </w:r>
-      <w:r>
-        <w:t xml:space="preserve">(GDPR Art. 35;</w:t>
-      </w:r>
-      <w:r>
-        <w:t xml:space="preserve"> </w:t>
-      </w:r>
-      <w:r>
-        <w:t xml:space="preserve">MITA AI-10/SEC-02) — develop on</w:t>
-      </w:r>
-      <w:r>
-        <w:t xml:space="preserve"> </w:t>
-      </w:r>
-      <w:r>
-        <w:rPr>
-          <w:b/>
-        </w:rPr>
-        <w:t xml:space="preserve">anonymised</w:t>
-      </w:r>
-      <w:r>
-        <w:t xml:space="preserve"> </w:t>
-      </w:r>
-      <w:r>
-        <w:t xml:space="preserve">dev data until then. This is a hard go-live gate</w:t>
-      </w:r>
-      <w:r>
-        <w:t xml:space="preserve"> </w:t>
-      </w:r>
-      <w:r>
-        <w:t xml:space="preserve">(</w:t>
+        <w:t xml:space="preserve">Security &amp; data protection — real data in test (read this).</w:t>
+      </w:r>
+      <w:r>
+        <w:t xml:space="preserve"> </w:t>
+      </w:r>
+      <w:r>
+        <w:t xml:space="preserve">Restricted-by-default;</w:t>
+      </w:r>
+      <w:r>
+        <w:t xml:space="preserve"> </w:t>
+      </w:r>
+      <w:r>
+        <w:t xml:space="preserve">classification cascades; access via Keycloak RBAC. Because MITA has no anonymisation capability yet,</w:t>
+      </w:r>
+      <w:r>
+        <w:t xml:space="preserve"> </w:t>
+      </w:r>
+      <w:r>
+        <w:t xml:space="preserve">the</w:t>
+      </w:r>
+      <w:r>
+        <w:t xml:space="preserve"> </w:t>
+      </w:r>
+      <w:r>
+        <w:rPr>
+          <w:b/>
+        </w:rPr>
+        <w:t xml:space="preserve">test environment holds real, un-anonymised Restricted data</w:t>
+      </w:r>
+      <w:r>
+        <w:t xml:space="preserve">, so it must be treated with the</w:t>
+      </w:r>
+      <w:r>
+        <w:t xml:space="preserve"> </w:t>
+      </w:r>
+      <w:r>
+        <w:rPr>
+          <w:b/>
+        </w:rPr>
+        <w:t xml:space="preserve">same protection as production from day one</w:t>
+      </w:r>
+      <w:r>
+        <w:t xml:space="preserve">, with these compensating controls:</w:t>
+      </w:r>
+    </w:p>
+    <w:p>
+      <w:pPr>
+        <w:numPr>
+          <w:ilvl w:val="1"/>
+          <w:numId w:val="1025"/>
+        </w:numPr>
+        <w:pStyle w:val="Compact"/>
+      </w:pPr>
+      <w:r>
+        <w:rPr>
+          <w:b/>
+        </w:rPr>
+        <w:t xml:space="preserve">DPO approval first.</w:t>
+      </w:r>
+      <w:r>
+        <w:t xml:space="preserve"> </w:t>
+      </w:r>
+      <w:r>
+        <w:t xml:space="preserve">The</w:t>
+      </w:r>
+      <w:r>
+        <w:t xml:space="preserve"> </w:t>
+      </w:r>
+      <w:r>
+        <w:rPr>
+          <w:b/>
+        </w:rPr>
+        <w:t xml:space="preserve">DPIA must explicitly cover the test/development environment</w:t>
+      </w:r>
+      <w:r>
+        <w:t xml:space="preserve"> </w:t>
+      </w:r>
+      <w:r>
+        <w:t xml:space="preserve">and</w:t>
+      </w:r>
+      <w:r>
+        <w:t xml:space="preserve"> </w:t>
+      </w:r>
+      <w:r>
+        <w:t xml:space="preserve">the residual risk of using production-grade personal data outside production; the DPO signs off</w:t>
+      </w:r>
+      <w:r>
+        <w:t xml:space="preserve"> </w:t>
+      </w:r>
+      <w:r>
+        <w:rPr>
+          <w:i/>
+        </w:rPr>
+        <w:t xml:space="preserve">before</w:t>
+      </w:r>
+      <w:r>
+        <w:t xml:space="preserve"> </w:t>
+      </w:r>
+      <w:r>
+        <w:t xml:space="preserve">the team touches real data (GDPR Art. 35; MITA AI-10/SEC-02).</w:t>
+      </w:r>
+    </w:p>
+    <w:p>
+      <w:pPr>
+        <w:numPr>
+          <w:ilvl w:val="1"/>
+          <w:numId w:val="1025"/>
+        </w:numPr>
+        <w:pStyle w:val="Compact"/>
+      </w:pPr>
+      <w:r>
+        <w:rPr>
+          <w:b/>
+        </w:rPr>
+        <w:t xml:space="preserve">Named, least-privilege access</w:t>
+      </w:r>
+      <w:r>
+        <w:t xml:space="preserve"> </w:t>
+      </w:r>
+      <w:r>
+        <w:t xml:space="preserve">via Keycloak — only authorised DP-team members, no shared</w:t>
+      </w:r>
+      <w:r>
+        <w:t xml:space="preserve"> </w:t>
+      </w:r>
+      <w:r>
+        <w:t xml:space="preserve">accounts;</w:t>
+      </w:r>
+      <w:r>
+        <w:t xml:space="preserve"> </w:t>
+      </w:r>
+      <w:r>
+        <w:rPr>
+          <w:b/>
+        </w:rPr>
+        <w:t xml:space="preserve">audit logging</w:t>
+      </w:r>
+      <w:r>
+        <w:t xml:space="preserve"> </w:t>
+      </w:r>
+      <w:r>
+        <w:t xml:space="preserve">of access and queries on from the start.</w:t>
+      </w:r>
+    </w:p>
+    <w:p>
+      <w:pPr>
+        <w:numPr>
+          <w:ilvl w:val="1"/>
+          <w:numId w:val="1025"/>
+        </w:numPr>
+        <w:pStyle w:val="Compact"/>
+      </w:pPr>
+      <w:r>
+        <w:rPr>
+          <w:b/>
+        </w:rPr>
+        <w:t xml:space="preserve">The environment is Restricted:</w:t>
+      </w:r>
+      <w:r>
+        <w:t xml:space="preserve"> </w:t>
+      </w:r>
+      <w:r>
+        <w:t xml:space="preserve">encrypted at rest/in transit, on the MAGNET/secured network,</w:t>
+      </w:r>
+      <w:r>
+        <w:t xml:space="preserve"> </w:t>
+      </w:r>
+      <w:r>
+        <w:rPr>
+          <w:b/>
+        </w:rPr>
+        <w:t xml:space="preserve">no copying data to laptops, email, external drives, screenshots or chat tools</w:t>
+      </w:r>
+      <w:r>
+        <w:t xml:space="preserve">, and secure</w:t>
+      </w:r>
+      <w:r>
+        <w:t xml:space="preserve"> </w:t>
+      </w:r>
+      <w:r>
+        <w:t xml:space="preserve">disposal of any extract.</w:t>
+      </w:r>
+    </w:p>
+    <w:p>
+      <w:pPr>
+        <w:numPr>
+          <w:ilvl w:val="1"/>
+          <w:numId w:val="1025"/>
+        </w:numPr>
+        <w:pStyle w:val="Compact"/>
+      </w:pPr>
+      <w:r>
+        <w:rPr>
+          <w:b/>
+        </w:rPr>
+        <w:t xml:space="preserve">Record it as a known constraint</w:t>
+      </w:r>
+      <w:r>
+        <w:t xml:space="preserve"> </w:t>
+      </w:r>
+      <w:r>
+        <w:t xml:space="preserve">(an ADR via</w:t>
+      </w:r>
+      <w:r>
+        <w:t xml:space="preserve"> </w:t>
+      </w:r>
+      <w:r>
+        <w:rPr>
+          <w:rStyle w:val="VerbatimChar"/>
+        </w:rPr>
+        <w:t xml:space="preserve">mtca-architecture-principles</w:t>
+      </w:r>
+      <w:r>
+        <w:t xml:space="preserve">): real data is</w:t>
+      </w:r>
+      <w:r>
+        <w:t xml:space="preserve"> </w:t>
+      </w:r>
+      <w:r>
+        <w:t xml:space="preserve">used in test</w:t>
+      </w:r>
+      <w:r>
+        <w:t xml:space="preserve"> </w:t>
+      </w:r>
+      <w:r>
+        <w:rPr>
+          <w:i/>
+        </w:rPr>
+        <w:t xml:space="preserve">pending</w:t>
+      </w:r>
+      <w:r>
+        <w:t xml:space="preserve"> </w:t>
+      </w:r>
+      <w:r>
+        <w:t xml:space="preserve">an anonymisation/pseudonymisation capability at MITA, which is the agreed</w:t>
+      </w:r>
+      <w:r>
+        <w:t xml:space="preserve"> </w:t>
+      </w:r>
+      <w:r>
+        <w:t xml:space="preserve">remediation; revisit when the tool exists.</w:t>
+      </w:r>
+      <w:r>
+        <w:t xml:space="preserve"> </w:t>
+      </w:r>
+      <w:r>
+        <w:t xml:space="preserve">This is still a hard go-live gate (</w:t>
       </w:r>
       <w:r>
         <w:rPr>
@@ -5315,7 +5585,13 @@
         <w:t xml:space="preserve"> </w:t>
       </w:r>
       <w:r>
-        <w:t xml:space="preserve">SEC-2).</w:t>
+        <w:t xml:space="preserve">SEC-2) — now covering test as well as</w:t>
+      </w:r>
+      <w:r>
+        <w:t xml:space="preserve"> </w:t>
+      </w:r>
+      <w:r>
+        <w:t xml:space="preserve">production.</w:t>
       </w:r>
     </w:p>
     <w:p>
@@ -5906,172 +6182,180 @@
       <w:pPr>
         <w:pStyle w:val="Heading2"/>
       </w:pPr>
-      <w:bookmarkStart w:id="39" w:name="daily-working-rhythm"/>
-      <w:r>
-        <w:t xml:space="preserve">9. Daily working rhythm</w:t>
+      <w:bookmarkStart w:id="39" w:name="X4b5337c2ce4f49090b410b6978f4d136ea2d084"/>
+      <w:r>
+        <w:t xml:space="preserve">9. Working as a team of three (and the daily rhythm)</w:t>
       </w:r>
       <w:bookmarkEnd w:id="39"/>
     </w:p>
     <w:p>
       <w:pPr>
-        <w:numPr>
-          <w:ilvl w:val="0"/>
-          <w:numId w:val="1025"/>
-        </w:numPr>
-        <w:pStyle w:val="Compact"/>
-      </w:pPr>
-      <w:r>
-        <w:rPr>
-          <w:b/>
-        </w:rPr>
-        <w:t xml:space="preserve">Pick the next slice</w:t>
-      </w:r>
-      <w:r>
-        <w:t xml:space="preserve"> </w:t>
-      </w:r>
-      <w:r>
-        <w:t xml:space="preserve">(a source, a mart, a dashboard) from the backlog.</w:t>
-      </w:r>
-    </w:p>
-    <w:p>
-      <w:pPr>
-        <w:numPr>
-          <w:ilvl w:val="0"/>
-          <w:numId w:val="1025"/>
-        </w:numPr>
-        <w:pStyle w:val="Compact"/>
-      </w:pPr>
-      <w:r>
-        <w:rPr>
-          <w:b/>
-        </w:rPr>
-        <w:t xml:space="preserve">Decide the track</w:t>
-      </w:r>
-      <w:r>
-        <w:t xml:space="preserve">: generate in Cowork (Track A); run dbt/loads/imports and commit on your</w:t>
-      </w:r>
-      <w:r>
-        <w:t xml:space="preserve"> </w:t>
-      </w:r>
-      <w:r>
-        <w:t xml:space="preserve">workstation (Track B). Ask</w:t>
-      </w:r>
-      <w:r>
-        <w:t xml:space="preserve"> </w:t>
-      </w:r>
-      <w:r>
-        <w:rPr>
-          <w:rStyle w:val="VerbatimChar"/>
-        </w:rPr>
-        <w:t xml:space="preserve">mtca-dev-workflow</w:t>
-      </w:r>
-      <w:r>
-        <w:t xml:space="preserve"> </w:t>
-      </w:r>
-      <w:r>
-        <w:t xml:space="preserve">if unsure.</w:t>
-      </w:r>
-    </w:p>
-    <w:p>
-      <w:pPr>
-        <w:numPr>
-          <w:ilvl w:val="0"/>
-          <w:numId w:val="1025"/>
-        </w:numPr>
-        <w:pStyle w:val="Compact"/>
-      </w:pPr>
-      <w:r>
-        <w:rPr>
-          <w:b/>
-        </w:rPr>
-        <w:t xml:space="preserve">Use the skill, don’t free-hand</w:t>
-      </w:r>
-      <w:r>
-        <w:t xml:space="preserve">: say what you want; review the generated spec/output; fill any</w:t>
-      </w:r>
-      <w:r>
-        <w:t xml:space="preserve"> </w:t>
-      </w:r>
-      <w:r>
-        <w:rPr>
-          <w:rStyle w:val="VerbatimChar"/>
-        </w:rPr>
-        <w:t xml:space="preserve">TODO</w:t>
-      </w:r>
-      <w:r>
-        <w:t xml:space="preserve">/DRAFT; run it live;</w:t>
-      </w:r>
-      <w:r>
-        <w:t xml:space="preserve"> </w:t>
-      </w:r>
-      <w:r>
-        <w:rPr>
-          <w:b/>
-        </w:rPr>
-        <w:t xml:space="preserve">commit</w:t>
-      </w:r>
-      <w:r>
-        <w:t xml:space="preserve">.</w:t>
-      </w:r>
-    </w:p>
-    <w:p>
-      <w:pPr>
-        <w:numPr>
-          <w:ilvl w:val="0"/>
-          <w:numId w:val="1025"/>
-        </w:numPr>
-        <w:pStyle w:val="Compact"/>
-      </w:pPr>
-      <w:r>
-        <w:rPr>
-          <w:b/>
-        </w:rPr>
-        <w:t xml:space="preserve">Pair</w:t>
-      </w:r>
-      <w:r>
-        <w:t xml:space="preserve">: shadow → pair → lead. The first time on each skill, pair with the STX/contractor; then the</w:t>
-      </w:r>
-      <w:r>
-        <w:t xml:space="preserve"> </w:t>
-      </w:r>
-      <w:r>
-        <w:t xml:space="preserve">team leads. The skill is the script for this.</w:t>
-      </w:r>
-    </w:p>
-    <w:p>
-      <w:pPr>
-        <w:numPr>
-          <w:ilvl w:val="0"/>
-          <w:numId w:val="1025"/>
-        </w:numPr>
-        <w:pStyle w:val="Compact"/>
-      </w:pPr>
-      <w:r>
-        <w:rPr>
-          <w:b/>
-        </w:rPr>
-        <w:t xml:space="preserve">Close the loop</w:t>
-      </w:r>
-      <w:r>
-        <w:t xml:space="preserve">: run the relevant gate (DQ, verify, readiness) before calling it done.</w:t>
-      </w:r>
-    </w:p>
-    <w:p>
-      <w:r>
-        <w:pict>
-          <v:rect style="width:0;height:1.5pt" o:hralign="center" o:hrstd="t" o:hr="t"/>
-        </w:pict>
-      </w:r>
-    </w:p>
-    <w:p>
-      <w:pPr>
-        <w:pStyle w:val="Heading2"/>
-      </w:pPr>
-      <w:bookmarkStart w:id="40" w:name="troubleshooting-faq"/>
-      <w:r>
-        <w:t xml:space="preserve">10. Troubleshooting &amp; FAQ</w:t>
-      </w:r>
-      <w:bookmarkEnd w:id="40"/>
+        <w:pStyle w:val="FirstParagraph"/>
+      </w:pPr>
+      <w:r>
+        <w:t xml:space="preserve">Three developers can work in parallel without the outputs diverging —</w:t>
+      </w:r>
+      <w:r>
+        <w:t xml:space="preserve"> </w:t>
+      </w:r>
+      <w:r>
+        <w:rPr>
+          <w:b/>
+        </w:rPr>
+        <w:t xml:space="preserve">because the skills, the</w:t>
+      </w:r>
+      <w:r>
+        <w:rPr>
+          <w:b/>
+        </w:rPr>
+        <w:t xml:space="preserve"> </w:t>
+      </w:r>
+      <w:r>
+        <w:rPr>
+          <w:b/>
+        </w:rPr>
+        <w:t xml:space="preserve">conventions and the gates enforce consistency for you</w:t>
+      </w:r>
+      <w:r>
+        <w:t xml:space="preserve">. Three people using the same skills produce</w:t>
+      </w:r>
+      <w:r>
+        <w:t xml:space="preserve"> </w:t>
+      </w:r>
+      <w:r>
+        <w:t xml:space="preserve">uniform work by construction:</w:t>
+      </w:r>
+      <w:r>
+        <w:t xml:space="preserve"> </w:t>
+      </w:r>
+      <w:r>
+        <w:rPr>
+          <w:rStyle w:val="VerbatimChar"/>
+        </w:rPr>
+        <w:t xml:space="preserve">repo-scaffold</w:t>
+      </w:r>
+      <w:r>
+        <w:t xml:space="preserve"> </w:t>
+      </w:r>
+      <w:r>
+        <w:t xml:space="preserve">fixes the layout and naming; the generators are</w:t>
+      </w:r>
+      <w:r>
+        <w:t xml:space="preserve"> </w:t>
+      </w:r>
+      <w:r>
+        <w:t xml:space="preserve">deterministic;</w:t>
+      </w:r>
+      <w:r>
+        <w:t xml:space="preserve"> </w:t>
+      </w:r>
+      <w:r>
+        <w:rPr>
+          <w:rStyle w:val="VerbatimChar"/>
+        </w:rPr>
+        <w:t xml:space="preserve">mtca-architecture-principles</w:t>
+      </w:r>
+      <w:r>
+        <w:t xml:space="preserve"> </w:t>
+      </w:r>
+      <w:r>
+        <w:t xml:space="preserve">settles design choices by citation; and the</w:t>
+      </w:r>
+      <w:r>
+        <w:t xml:space="preserve"> </w:t>
+      </w:r>
+      <w:r>
+        <w:rPr>
+          <w:rStyle w:val="VerbatimChar"/>
+        </w:rPr>
+        <w:t xml:space="preserve">int_</w:t>
+      </w:r>
+      <w:r>
+        <w:t xml:space="preserve"> </w:t>
+      </w:r>
+      <w:r>
+        <w:t xml:space="preserve">join</w:t>
+      </w:r>
+      <w:r>
+        <w:t xml:space="preserve"> </w:t>
+      </w:r>
+      <w:r>
+        <w:t xml:space="preserve">contracts, the DQ gates and the verification gate catch divergence automatically. So the job is to</w:t>
+      </w:r>
+      <w:r>
+        <w:t xml:space="preserve"> </w:t>
+      </w:r>
+      <w:r>
+        <w:rPr>
+          <w:b/>
+        </w:rPr>
+        <w:t xml:space="preserve">split work so people don’t collide, and review each other</w:t>
+      </w:r>
+      <w:r>
+        <w:t xml:space="preserve"> </w:t>
+      </w:r>
+      <w:r>
+        <w:t xml:space="preserve">— not to make everyone do the same thing.</w:t>
+      </w:r>
+    </w:p>
+    <w:p>
+      <w:pPr>
+        <w:pStyle w:val="BodyText"/>
+      </w:pPr>
+      <w:r>
+        <w:rPr>
+          <w:b/>
+        </w:rPr>
+        <w:t xml:space="preserve">Split by vertical ownership, not by horizontal layer.</w:t>
+      </w:r>
+      <w:r>
+        <w:t xml:space="preserve"> </w:t>
+      </w:r>
+      <w:r>
+        <w:t xml:space="preserve">Don’t have one person do</w:t>
+      </w:r>
+      <w:r>
+        <w:t xml:space="preserve"> </w:t>
+      </w:r>
+      <w:r>
+        <w:t xml:space="preserve">“</w:t>
+      </w:r>
+      <w:r>
+        <w:t xml:space="preserve">all staging</w:t>
+      </w:r>
+      <w:r>
+        <w:t xml:space="preserve">”</w:t>
+      </w:r>
+      <w:r>
+        <w:t xml:space="preserve"> </w:t>
+      </w:r>
+      <w:r>
+        <w:t xml:space="preserve">and</w:t>
+      </w:r>
+      <w:r>
+        <w:t xml:space="preserve"> </w:t>
+      </w:r>
+      <w:r>
+        <w:t xml:space="preserve">another</w:t>
+      </w:r>
+      <w:r>
+        <w:t xml:space="preserve"> </w:t>
+      </w:r>
+      <w:r>
+        <w:t xml:space="preserve">“</w:t>
+      </w:r>
+      <w:r>
+        <w:t xml:space="preserve">all marts</w:t>
+      </w:r>
+      <w:r>
+        <w:t xml:space="preserve">”</w:t>
+      </w:r>
+      <w:r>
+        <w:t xml:space="preserve"> </w:t>
+      </w:r>
+      <w:r>
+        <w:t xml:space="preserve">— that creates wait-chains and blurred ownership. Instead:</w:t>
+      </w:r>
     </w:p>
     <w:p>
       <w:pPr>
@@ -6085,64 +6369,52 @@
         <w:rPr>
           <w:b/>
         </w:rPr>
-        <w:t xml:space="preserve">“</w:t>
-      </w:r>
-      <w:r>
-        <w:rPr>
-          <w:b/>
-        </w:rPr>
-        <w:t xml:space="preserve">dbt didn’t run in Cowork.</w:t>
-      </w:r>
-      <w:r>
-        <w:rPr>
-          <w:b/>
-        </w:rPr>
-        <w:t xml:space="preserve">”</w:t>
-      </w:r>
-      <w:r>
-        <w:t xml:space="preserve"> </w:t>
-      </w:r>
-      <w:r>
-        <w:t xml:space="preserve">Correct — that’s Track B. Cowork</w:t>
-      </w:r>
-      <w:r>
-        <w:t xml:space="preserve"> </w:t>
-      </w:r>
-      <w:r>
-        <w:rPr>
-          <w:i/>
-        </w:rPr>
-        <w:t xml:space="preserve">generates</w:t>
-      </w:r>
-      <w:r>
-        <w:t xml:space="preserve"> </w:t>
-      </w:r>
-      <w:r>
-        <w:t xml:space="preserve">the models; you run</w:t>
-      </w:r>
-      <w:r>
-        <w:t xml:space="preserve"> </w:t>
-      </w:r>
-      <w:r>
-        <w:rPr>
-          <w:rStyle w:val="VerbatimChar"/>
-        </w:rPr>
-        <w:t xml:space="preserve">dbt build</w:t>
-      </w:r>
-      <w:r>
-        <w:t xml:space="preserve"> </w:t>
-      </w:r>
-      <w:r>
-        <w:t xml:space="preserve">on your workstation/stack. (</w:t>
-      </w:r>
-      <w:r>
-        <w:rPr>
-          <w:rStyle w:val="VerbatimChar"/>
-        </w:rPr>
-        <w:t xml:space="preserve">mtca-dev-workflow</w:t>
-      </w:r>
-      <w:r>
-        <w:t xml:space="preserve">.)</w:t>
+        <w:t xml:space="preserve">The first (Debt) slice: build it together.</w:t>
+      </w:r>
+      <w:r>
+        <w:t xml:space="preserve"> </w:t>
+      </w:r>
+      <w:r>
+        <w:t xml:space="preserve">One developer drives, the other two review,</w:t>
+      </w:r>
+      <w:r>
+        <w:t xml:space="preserve"> </w:t>
+      </w:r>
+      <w:r>
+        <w:rPr>
+          <w:b/>
+        </w:rPr>
+        <w:t xml:space="preserve">rotating</w:t>
+      </w:r>
+      <w:r>
+        <w:rPr>
+          <w:b/>
+        </w:rPr>
+        <w:t xml:space="preserve"> </w:t>
+      </w:r>
+      <w:r>
+        <w:rPr>
+          <w:b/>
+        </w:rPr>
+        <w:t xml:space="preserve">the keyboard per milestone</w:t>
+      </w:r>
+      <w:r>
+        <w:t xml:space="preserve"> </w:t>
+      </w:r>
+      <w:r>
+        <w:t xml:space="preserve">(M1 ingestion → M2/M3 modelling → M4/M5 consumption → M6 go-live). Everyone</w:t>
+      </w:r>
+      <w:r>
+        <w:t xml:space="preserve"> </w:t>
+      </w:r>
+      <w:r>
+        <w:t xml:space="preserve">sees the whole path once. This is the shadow → pair → lead start, and it sets the patterns the rest of</w:t>
+      </w:r>
+      <w:r>
+        <w:t xml:space="preserve"> </w:t>
+      </w:r>
+      <w:r>
+        <w:t xml:space="preserve">the work copies.</w:t>
       </w:r>
     </w:p>
     <w:p>
@@ -6157,174 +6429,366 @@
         <w:rPr>
           <w:b/>
         </w:rPr>
-        <w:t xml:space="preserve">“</w:t>
-      </w:r>
-      <w:r>
-        <w:rPr>
-          <w:b/>
-        </w:rPr>
-        <w:t xml:space="preserve">git says</w:t>
-      </w:r>
-      <w:r>
-        <w:rPr>
-          <w:b/>
-        </w:rPr>
-        <w:t xml:space="preserve"> </w:t>
-      </w:r>
-      <w:r>
-        <w:rPr>
-          <w:rStyle w:val="VerbatimChar"/>
-          <w:b/>
-        </w:rPr>
-        <w:t xml:space="preserve">index.lock</w:t>
-      </w:r>
-      <w:r>
-        <w:rPr>
-          <w:b/>
-        </w:rPr>
-        <w:t xml:space="preserve"> </w:t>
-      </w:r>
-      <w:r>
-        <w:rPr>
-          <w:b/>
-        </w:rPr>
-        <w:t xml:space="preserve">exists / can’t commit.</w:t>
-      </w:r>
-      <w:r>
-        <w:rPr>
-          <w:b/>
-        </w:rPr>
-        <w:t xml:space="preserve">”</w:t>
-      </w:r>
-      <w:r>
-        <w:t xml:space="preserve"> </w:t>
-      </w:r>
-      <w:r>
-        <w:t xml:space="preserve">A git command was run inside the Cowork sandbox,</w:t>
-      </w:r>
-      <w:r>
-        <w:t xml:space="preserve"> </w:t>
-      </w:r>
-      <w:r>
-        <w:t xml:space="preserve">which can’t clean up its lock files. Run git</w:t>
-      </w:r>
-      <w:r>
-        <w:t xml:space="preserve"> </w:t>
-      </w:r>
-      <w:r>
-        <w:rPr>
-          <w:b/>
-        </w:rPr>
-        <w:t xml:space="preserve">on your workstation</w:t>
-      </w:r>
-      <w:r>
-        <w:t xml:space="preserve">; if locks are stranded, delete</w:t>
-      </w:r>
-      <w:r>
-        <w:t xml:space="preserve"> </w:t>
-      </w:r>
-      <w:r>
-        <w:rPr>
-          <w:rStyle w:val="VerbatimChar"/>
-        </w:rPr>
-        <w:t xml:space="preserve">.git/index.lock</w:t>
-      </w:r>
-      <w:r>
-        <w:t xml:space="preserve"> </w:t>
-      </w:r>
-      <w:r>
-        <w:t xml:space="preserve">(see</w:t>
-      </w:r>
-      <w:r>
-        <w:t xml:space="preserve"> </w:t>
-      </w:r>
-      <w:r>
-        <w:rPr>
-          <w:rStyle w:val="VerbatimChar"/>
-        </w:rPr>
-        <w:t xml:space="preserve">repo-scaffold/references/git-on-the-workstation.md</w:t>
+        <w:t xml:space="preserve">After the patterns are proven: parallelise by ownership.</w:t>
+      </w:r>
+      <w:r>
+        <w:t xml:space="preserve"> </w:t>
+      </w:r>
+      <w:r>
+        <w:t xml:space="preserve">Two workable splits:</w:t>
+      </w:r>
+    </w:p>
+    <w:p>
+      <w:pPr>
+        <w:numPr>
+          <w:ilvl w:val="1"/>
+          <w:numId w:val="1027"/>
+        </w:numPr>
+        <w:pStyle w:val="Compact"/>
+      </w:pPr>
+      <w:r>
+        <w:rPr>
+          <w:i/>
+        </w:rPr>
+        <w:t xml:space="preserve">By role</w:t>
+      </w:r>
+      <w:r>
+        <w:t xml:space="preserve"> </w:t>
+      </w:r>
+      <w:r>
+        <w:t xml:space="preserve">—</w:t>
+      </w:r>
+      <w:r>
+        <w:t xml:space="preserve"> </w:t>
+      </w:r>
+      <w:r>
+        <w:rPr>
+          <w:b/>
+        </w:rPr>
+        <w:t xml:space="preserve">Dev A</w:t>
+      </w:r>
+      <w:r>
+        <w:t xml:space="preserve"> </w:t>
+      </w:r>
+      <w:r>
+        <w:t xml:space="preserve">ingestion &amp; catalogue (</w:t>
+      </w:r>
+      <w:r>
+        <w:rPr>
+          <w:rStyle w:val="VerbatimChar"/>
+        </w:rPr>
+        <w:t xml:space="preserve">onboard-source</w:t>
+      </w:r>
+      <w:r>
+        <w:t xml:space="preserve">,</w:t>
+      </w:r>
+      <w:r>
+        <w:t xml:space="preserve"> </w:t>
+      </w:r>
+      <w:r>
+        <w:rPr>
+          <w:rStyle w:val="VerbatimChar"/>
+        </w:rPr>
+        <w:t xml:space="preserve">import-schema-to-catalogue</w:t>
+      </w:r>
+      <w:r>
+        <w:t xml:space="preserve">,</w:t>
+      </w:r>
+      <w:r>
+        <w:t xml:space="preserve"> </w:t>
+      </w:r>
+      <w:r>
+        <w:rPr>
+          <w:rStyle w:val="VerbatimChar"/>
+        </w:rPr>
+        <w:t xml:space="preserve">legacy-module-to-openmetadata</w:t>
+      </w:r>
+      <w:r>
+        <w:t xml:space="preserve">,</w:t>
+      </w:r>
+      <w:r>
+        <w:t xml:space="preserve"> </w:t>
+      </w:r>
+      <w:r>
+        <w:rPr>
+          <w:rStyle w:val="VerbatimChar"/>
+        </w:rPr>
+        <w:t xml:space="preserve">verify-catalogue-semantics</w:t>
+      </w:r>
+      <w:r>
+        <w:t xml:space="preserve">);</w:t>
+      </w:r>
+      <w:r>
+        <w:t xml:space="preserve"> </w:t>
+      </w:r>
+      <w:r>
+        <w:rPr>
+          <w:b/>
+        </w:rPr>
+        <w:t xml:space="preserve">Dev B</w:t>
+      </w:r>
+      <w:r>
+        <w:t xml:space="preserve"> </w:t>
+      </w:r>
+      <w:r>
+        <w:t xml:space="preserve">modelling &amp; quality</w:t>
+      </w:r>
+      <w:r>
+        <w:t xml:space="preserve"> </w:t>
+      </w:r>
+      <w:r>
+        <w:t xml:space="preserve">(</w:t>
+      </w:r>
+      <w:r>
+        <w:rPr>
+          <w:rStyle w:val="VerbatimChar"/>
+        </w:rPr>
+        <w:t xml:space="preserve">build-dbt-model</w:t>
+      </w:r>
+      <w:r>
+        <w:t xml:space="preserve">,</w:t>
+      </w:r>
+      <w:r>
+        <w:t xml:space="preserve"> </w:t>
+      </w:r>
+      <w:r>
+        <w:rPr>
+          <w:rStyle w:val="VerbatimChar"/>
+        </w:rPr>
+        <w:t xml:space="preserve">add-dq-checks</w:t>
+      </w:r>
+      <w:r>
+        <w:t xml:space="preserve">);</w:t>
+      </w:r>
+      <w:r>
+        <w:t xml:space="preserve"> </w:t>
+      </w:r>
+      <w:r>
+        <w:rPr>
+          <w:b/>
+        </w:rPr>
+        <w:t xml:space="preserve">Dev C</w:t>
+      </w:r>
+      <w:r>
+        <w:t xml:space="preserve"> </w:t>
+      </w:r>
+      <w:r>
+        <w:t xml:space="preserve">consumption &amp; ops (</w:t>
+      </w:r>
+      <w:r>
+        <w:rPr>
+          <w:rStyle w:val="VerbatimChar"/>
+        </w:rPr>
+        <w:t xml:space="preserve">build-superset-dashboard</w:t>
+      </w:r>
+      <w:r>
+        <w:t xml:space="preserve">,</w:t>
+      </w:r>
+      <w:r>
+        <w:t xml:space="preserve"> </w:t>
+      </w:r>
+      <w:r>
+        <w:rPr>
+          <w:rStyle w:val="VerbatimChar"/>
+        </w:rPr>
+        <w:t xml:space="preserve">expose-api</w:t>
+      </w:r>
+      <w:r>
+        <w:t xml:space="preserve">, CI/monitoring,</w:t>
+      </w:r>
+      <w:r>
+        <w:t xml:space="preserve"> </w:t>
+      </w:r>
+      <w:r>
+        <w:rPr>
+          <w:rStyle w:val="VerbatimChar"/>
+        </w:rPr>
+        <w:t xml:space="preserve">production-readiness-check</w:t>
       </w:r>
       <w:r>
         <w:t xml:space="preserve">).</w:t>
+      </w:r>
+    </w:p>
+    <w:p>
+      <w:pPr>
+        <w:numPr>
+          <w:ilvl w:val="1"/>
+          <w:numId w:val="1027"/>
+        </w:numPr>
+        <w:pStyle w:val="Compact"/>
+      </w:pPr>
+      <w:r>
+        <w:rPr>
+          <w:i/>
+        </w:rPr>
+        <w:t xml:space="preserve">By source/domain</w:t>
+      </w:r>
+      <w:r>
+        <w:t xml:space="preserve"> </w:t>
+      </w:r>
+      <w:r>
+        <w:t xml:space="preserve">(better once you’re doing breadth) — each developer owns a</w:t>
+      </w:r>
+      <w:r>
+        <w:t xml:space="preserve"> </w:t>
+      </w:r>
+      <w:r>
+        <w:rPr>
+          <w:b/>
+        </w:rPr>
+        <w:t xml:space="preserve">source or mart</w:t>
+      </w:r>
+      <w:r>
+        <w:rPr>
+          <w:b/>
+        </w:rPr>
+        <w:t xml:space="preserve"> </w:t>
+      </w:r>
+      <w:r>
+        <w:rPr>
+          <w:b/>
+        </w:rPr>
+        <w:t xml:space="preserve">family end-to-end</w:t>
+      </w:r>
+      <w:r>
+        <w:t xml:space="preserve"> </w:t>
+      </w:r>
+      <w:r>
+        <w:t xml:space="preserve">through the whole loop. Fewer hand-offs; each person carries their slice from</w:t>
+      </w:r>
+      <w:r>
+        <w:t xml:space="preserve"> </w:t>
+      </w:r>
+      <w:r>
+        <w:t xml:space="preserve">Bronze to a green gate.</w:t>
+      </w:r>
+    </w:p>
+    <w:p>
+      <w:pPr>
+        <w:pStyle w:val="FirstParagraph"/>
+      </w:pPr>
+      <w:r>
+        <w:rPr>
+          <w:b/>
+        </w:rPr>
+        <w:t xml:space="preserve">Appoint one owner for the shared core.</w:t>
+      </w:r>
+      <w:r>
+        <w:t xml:space="preserve"> </w:t>
+      </w:r>
+      <w:r>
+        <w:t xml:space="preserve">The biggest consistency risk is two people defining the same</w:t>
+      </w:r>
+      <w:r>
+        <w:t xml:space="preserve"> </w:t>
+      </w:r>
+      <w:r>
+        <w:t xml:space="preserve">thing differently. Give</w:t>
+      </w:r>
+      <w:r>
+        <w:t xml:space="preserve"> </w:t>
+      </w:r>
+      <w:r>
+        <w:rPr>
+          <w:b/>
+        </w:rPr>
+        <w:t xml:space="preserve">one developer (rotating) ownership of the single-source-of-truth pieces</w:t>
+      </w:r>
+      <w:r>
+        <w:t xml:space="preserve"> </w:t>
+      </w:r>
+      <w:r>
+        <w:t xml:space="preserve">—</w:t>
+      </w:r>
+      <w:r>
+        <w:t xml:space="preserve"> </w:t>
+      </w:r>
+      <w:r>
+        <w:rPr>
+          <w:rStyle w:val="VerbatimChar"/>
+        </w:rPr>
+        <w:t xml:space="preserve">int_taxpayer__master</w:t>
+      </w:r>
+      <w:r>
+        <w:t xml:space="preserve"> </w:t>
+      </w:r>
+      <w:r>
+        <w:t xml:space="preserve">(Taxpayer-360), the shared metric definitions, the naming conventions, and the</w:t>
+      </w:r>
+      <w:r>
+        <w:t xml:space="preserve"> </w:t>
+      </w:r>
+      <w:r>
+        <w:rPr>
+          <w:rStyle w:val="VerbatimChar"/>
+        </w:rPr>
+        <w:t xml:space="preserve">main</w:t>
+      </w:r>
+      <w:r>
+        <w:t xml:space="preserve"> </w:t>
+      </w:r>
+      <w:r>
+        <w:t xml:space="preserve">branch. Nobody else changes those without that owner’s review. Everyone else</w:t>
+      </w:r>
+      <w:r>
+        <w:t xml:space="preserve"> </w:t>
+      </w:r>
+      <w:r>
+        <w:rPr>
+          <w:b/>
+        </w:rPr>
+        <w:t xml:space="preserve">composes from</w:t>
+      </w:r>
+      <w:r>
+        <w:t xml:space="preserve"> </w:t>
+      </w:r>
+      <w:r>
+        <w:t xml:space="preserve">them (P6: pull from Gold, one definition per fact).</w:t>
+      </w:r>
+    </w:p>
+    <w:p>
+      <w:pPr>
+        <w:pStyle w:val="BodyText"/>
+      </w:pPr>
+      <w:r>
+        <w:rPr>
+          <w:b/>
+        </w:rPr>
+        <w:t xml:space="preserve">Git is the consistency backbone</w:t>
+      </w:r>
+      <w:r>
+        <w:t xml:space="preserve"> </w:t>
+      </w:r>
+      <w:r>
+        <w:t xml:space="preserve">(this is where parallel work converges):</w:t>
       </w:r>
     </w:p>
     <w:p>
       <w:pPr>
         <w:numPr>
           <w:ilvl w:val="0"/>
-          <w:numId w:val="1026"/>
+          <w:numId w:val="1028"/>
         </w:numPr>
         <w:pStyle w:val="Compact"/>
       </w:pPr>
       <w:r>
-        <w:rPr>
-          <w:b/>
-        </w:rPr>
-        <w:t xml:space="preserve">“</w:t>
-      </w:r>
-      <w:r>
-        <w:rPr>
-          <w:b/>
-        </w:rPr>
-        <w:t xml:space="preserve">The script left files inside the skill folder.</w:t>
-      </w:r>
-      <w:r>
-        <w:rPr>
-          <w:b/>
-        </w:rPr>
-        <w:t xml:space="preserve">”</w:t>
-      </w:r>
-      <w:r>
-        <w:t xml:space="preserve"> </w:t>
-      </w:r>
-      <w:r>
-        <w:t xml:space="preserve">Point</w:t>
-      </w:r>
-      <w:r>
-        <w:t xml:space="preserve"> </w:t>
-      </w:r>
-      <w:r>
-        <w:rPr>
-          <w:rStyle w:val="VerbatimChar"/>
-        </w:rPr>
-        <w:t xml:space="preserve">--out</w:t>
-      </w:r>
-      <w:r>
-        <w:t xml:space="preserve">/</w:t>
-      </w:r>
-      <w:r>
-        <w:rPr>
-          <w:rStyle w:val="VerbatimChar"/>
-        </w:rPr>
-        <w:t xml:space="preserve">--repo</w:t>
-      </w:r>
-      <w:r>
-        <w:t xml:space="preserve"> </w:t>
-      </w:r>
-      <w:r>
-        <w:t xml:space="preserve">at your repo’s workspace</w:t>
-      </w:r>
-      <w:r>
-        <w:t xml:space="preserve"> </w:t>
-      </w:r>
-      <w:r>
-        <w:t xml:space="preserve">(e.g. </w:t>
-      </w:r>
-      <w:r>
-        <w:rPr>
-          <w:rStyle w:val="VerbatimChar"/>
-        </w:rPr>
-        <w:t xml:space="preserve">catalogue/module-semantics/</w:t>
-      </w:r>
-      <w:r>
-        <w:t xml:space="preserve">), not the skill directory.</w:t>
+        <w:t xml:space="preserve">Branch per task (</w:t>
+      </w:r>
+      <w:r>
+        <w:rPr>
+          <w:rStyle w:val="VerbatimChar"/>
+        </w:rPr>
+        <w:t xml:space="preserve">feat/debt-aged-balances</w:t>
+      </w:r>
+      <w:r>
+        <w:t xml:space="preserve">); keep PRs small.</w:t>
       </w:r>
     </w:p>
     <w:p>
       <w:pPr>
         <w:numPr>
           <w:ilvl w:val="0"/>
-          <w:numId w:val="1026"/>
+          <w:numId w:val="1028"/>
         </w:numPr>
         <w:pStyle w:val="Compact"/>
       </w:pPr>
@@ -6332,143 +6796,105 @@
         <w:rPr>
           <w:b/>
         </w:rPr>
-        <w:t xml:space="preserve">“</w:t>
-      </w:r>
-      <w:r>
-        <w:rPr>
-          <w:b/>
-        </w:rPr>
-        <w:t xml:space="preserve">A YAML-spec skill says</w:t>
-      </w:r>
-      <w:r>
-        <w:rPr>
-          <w:b/>
-        </w:rPr>
-        <w:t xml:space="preserve"> </w:t>
-      </w:r>
-      <w:r>
-        <w:rPr>
-          <w:b/>
-        </w:rPr>
-        <w:t xml:space="preserve">‘</w:t>
-      </w:r>
-      <w:r>
-        <w:rPr>
-          <w:b/>
-        </w:rPr>
-        <w:t xml:space="preserve">install pyyaml</w:t>
-      </w:r>
-      <w:r>
-        <w:rPr>
-          <w:b/>
-        </w:rPr>
-        <w:t xml:space="preserve">’</w:t>
-      </w:r>
-      <w:r>
-        <w:rPr>
-          <w:b/>
-        </w:rPr>
-        <w:t xml:space="preserve">.</w:t>
-      </w:r>
-      <w:r>
-        <w:rPr>
-          <w:b/>
-        </w:rPr>
-        <w:t xml:space="preserve">”</w:t>
-      </w:r>
-      <w:r>
-        <w:t xml:space="preserve"> </w:t>
-      </w:r>
-      <w:r>
-        <w:t xml:space="preserve">Install PyYAML (</w:t>
-      </w:r>
-      <w:r>
-        <w:rPr>
-          <w:rStyle w:val="VerbatimChar"/>
-        </w:rPr>
-        <w:t xml:space="preserve">pip install pyyaml</w:t>
-      </w:r>
-      <w:r>
-        <w:t xml:space="preserve">, or</w:t>
-      </w:r>
-      <w:r>
-        <w:t xml:space="preserve"> </w:t>
-      </w:r>
-      <w:r>
-        <w:rPr>
-          <w:rStyle w:val="VerbatimChar"/>
-        </w:rPr>
-        <w:t xml:space="preserve">python tasks.py setup</w:t>
-      </w:r>
-      <w:r>
-        <w:t xml:space="preserve">). The spec-reading skills need it.</w:t>
+        <w:t xml:space="preserve">Every PR is reviewed by another developer before merge</w:t>
+      </w:r>
+      <w:r>
+        <w:t xml:space="preserve"> </w:t>
+      </w:r>
+      <w:r>
+        <w:t xml:space="preserve">— peer review is where consistency is</w:t>
+      </w:r>
+      <w:r>
+        <w:t xml:space="preserve"> </w:t>
+      </w:r>
+      <w:r>
+        <w:t xml:space="preserve">actually enforced.</w:t>
       </w:r>
     </w:p>
     <w:p>
       <w:pPr>
         <w:numPr>
           <w:ilvl w:val="0"/>
-          <w:numId w:val="1026"/>
+          <w:numId w:val="1028"/>
         </w:numPr>
         <w:pStyle w:val="Compact"/>
       </w:pPr>
       <w:r>
         <w:rPr>
-          <w:b/>
-        </w:rPr>
-        <w:t xml:space="preserve">“</w:t>
-      </w:r>
-      <w:r>
-        <w:rPr>
-          <w:b/>
-        </w:rPr>
-        <w:t xml:space="preserve">The accuracy DQ test passes but we never wrote the reconciliation.</w:t>
-      </w:r>
-      <w:r>
-        <w:rPr>
-          <w:b/>
-        </w:rPr>
-        <w:t xml:space="preserve">”</w:t>
-      </w:r>
-      <w:r>
-        <w:t xml:space="preserve"> </w:t>
-      </w:r>
-      <w:r>
-        <w:t xml:space="preserve">That’s the deliberate</w:t>
-      </w:r>
-      <w:r>
-        <w:t xml:space="preserve"> </w:t>
-      </w:r>
-      <w:r>
-        <w:t xml:space="preserve">stub — accuracy is an</w:t>
-      </w:r>
-      <w:r>
-        <w:t xml:space="preserve"> </w:t>
-      </w:r>
-      <w:r>
-        <w:rPr>
-          <w:b/>
-        </w:rPr>
-        <w:t xml:space="preserve">open control</w:t>
-      </w:r>
-      <w:r>
-        <w:t xml:space="preserve"> </w:t>
-      </w:r>
-      <w:r>
-        <w:t xml:space="preserve">until you implement the real cross-source check; don’t read</w:t>
-      </w:r>
-      <w:r>
-        <w:t xml:space="preserve"> </w:t>
-      </w:r>
-      <w:r>
-        <w:t xml:space="preserve">the green as done.</w:t>
+          <w:rStyle w:val="VerbatimChar"/>
+        </w:rPr>
+        <w:t xml:space="preserve">main</w:t>
+      </w:r>
+      <w:r>
+        <w:t xml:space="preserve"> </w:t>
+      </w:r>
+      <w:r>
+        <w:t xml:space="preserve">is</w:t>
+      </w:r>
+      <w:r>
+        <w:t xml:space="preserve"> </w:t>
+      </w:r>
+      <w:r>
+        <w:rPr>
+          <w:b/>
+        </w:rPr>
+        <w:t xml:space="preserve">protected</w:t>
+      </w:r>
+      <w:r>
+        <w:t xml:space="preserve">, and</w:t>
+      </w:r>
+      <w:r>
+        <w:t xml:space="preserve"> </w:t>
+      </w:r>
+      <w:r>
+        <w:rPr>
+          <w:b/>
+        </w:rPr>
+        <w:t xml:space="preserve">CI runs</w:t>
+      </w:r>
+      <w:r>
+        <w:rPr>
+          <w:b/>
+        </w:rPr>
+        <w:t xml:space="preserve"> </w:t>
+      </w:r>
+      <w:r>
+        <w:rPr>
+          <w:rStyle w:val="VerbatimChar"/>
+          <w:b/>
+        </w:rPr>
+        <w:t xml:space="preserve">dbt test</w:t>
+      </w:r>
+      <w:r>
+        <w:rPr>
+          <w:b/>
+        </w:rPr>
+        <w:t xml:space="preserve"> </w:t>
+      </w:r>
+      <w:r>
+        <w:rPr>
+          <w:b/>
+        </w:rPr>
+        <w:t xml:space="preserve">+ the pre-commit hooks on every PR</w:t>
+      </w:r>
+      <w:r>
+        <w:t xml:space="preserve"> </w:t>
+      </w:r>
+      <w:r>
+        <w:t xml:space="preserve">— a red test</w:t>
+      </w:r>
+      <w:r>
+        <w:t xml:space="preserve"> </w:t>
+      </w:r>
+      <w:r>
+        <w:t xml:space="preserve">blocks the merge.</w:t>
       </w:r>
     </w:p>
     <w:p>
       <w:pPr>
         <w:numPr>
           <w:ilvl w:val="0"/>
-          <w:numId w:val="1026"/>
+          <w:numId w:val="1028"/>
         </w:numPr>
         <w:pStyle w:val="Compact"/>
       </w:pPr>
@@ -6476,53 +6902,199 @@
         <w:rPr>
           <w:b/>
         </w:rPr>
-        <w:t xml:space="preserve">“</w:t>
-      </w:r>
-      <w:r>
-        <w:rPr>
-          <w:b/>
-        </w:rPr>
-        <w:t xml:space="preserve">A description is unclear.</w:t>
-      </w:r>
-      <w:r>
-        <w:rPr>
-          <w:b/>
-        </w:rPr>
-        <w:t xml:space="preserve">”</w:t>
-      </w:r>
-      <w:r>
-        <w:t xml:space="preserve"> </w:t>
-      </w:r>
-      <w:r>
-        <w:t xml:space="preserve">Mark it</w:t>
-      </w:r>
-      <w:r>
-        <w:t xml:space="preserve"> </w:t>
-      </w:r>
-      <w:r>
-        <w:rPr>
-          <w:rStyle w:val="VerbatimChar"/>
-        </w:rPr>
-        <w:t xml:space="preserve">to_confirm</w:t>
-      </w:r>
-      <w:r>
-        <w:t xml:space="preserve"> </w:t>
-      </w:r>
-      <w:r>
-        <w:t xml:space="preserve">(not a guess) and resolve it with the Data</w:t>
-      </w:r>
-      <w:r>
-        <w:t xml:space="preserve"> </w:t>
-      </w:r>
-      <w:r>
-        <w:t xml:space="preserve">Owner; the verify gate keeps DRAFT meaning out of marts.</w:t>
-      </w:r>
+        <w:t xml:space="preserve">One artefact, one owner at a time</w:t>
+      </w:r>
+      <w:r>
+        <w:t xml:space="preserve"> </w:t>
+      </w:r>
+      <w:r>
+        <w:t xml:space="preserve">— don’t let two people edit the same model/spec; the board</w:t>
+      </w:r>
+      <w:r>
+        <w:t xml:space="preserve"> </w:t>
+      </w:r>
+      <w:r>
+        <w:t xml:space="preserve">shows who owns what.</w:t>
+      </w:r>
+    </w:p>
+    <w:p>
+      <w:pPr>
+        <w:pStyle w:val="FirstParagraph"/>
+      </w:pPr>
+      <w:r>
+        <w:rPr>
+          <w:b/>
+        </w:rPr>
+        <w:t xml:space="preserve">Cadence:</w:t>
+      </w:r>
+      <w:r>
+        <w:t xml:space="preserve"> </w:t>
+      </w:r>
+      <w:r>
+        <w:t xml:space="preserve">a 15-minute daily standup (who’s on what, blockers, who needs whose output); a shared</w:t>
+      </w:r>
+      <w:r>
+        <w:t xml:space="preserve"> </w:t>
+      </w:r>
+      <w:r>
+        <w:t xml:space="preserve">backlog/board with clear owners (the coverage and</w:t>
+      </w:r>
+      <w:r>
+        <w:t xml:space="preserve"> </w:t>
+      </w:r>
+      <w:r>
+        <w:rPr>
+          <w:rStyle w:val="VerbatimChar"/>
+        </w:rPr>
+        <w:t xml:space="preserve">onboard-consumer</w:t>
+      </w:r>
+      <w:r>
+        <w:t xml:space="preserve"> </w:t>
+      </w:r>
+      <w:r>
+        <w:t xml:space="preserve">backlogs feed it); a weekly</w:t>
+      </w:r>
+      <w:r>
+        <w:t xml:space="preserve"> </w:t>
+      </w:r>
+      <w:r>
+        <w:t xml:space="preserve">integration + a short design huddle for any cross-cutting decision (</w:t>
+      </w:r>
+      <w:r>
+        <w:rPr>
+          <w:b/>
+        </w:rPr>
+        <w:t xml:space="preserve">record it as an ADR</w:t>
+      </w:r>
+      <w:r>
+        <w:t xml:space="preserve"> </w:t>
+      </w:r>
+      <w:r>
+        <w:t xml:space="preserve">via</w:t>
+      </w:r>
+      <w:r>
+        <w:t xml:space="preserve"> </w:t>
+      </w:r>
+      <w:r>
+        <w:rPr>
+          <w:rStyle w:val="VerbatimChar"/>
+        </w:rPr>
+        <w:t xml:space="preserve">mtca-architecture-principles</w:t>
+      </w:r>
+      <w:r>
+        <w:t xml:space="preserve">).</w:t>
+      </w:r>
+      <w:r>
+        <w:t xml:space="preserve"> </w:t>
+      </w:r>
+      <w:r>
+        <w:rPr>
+          <w:b/>
+        </w:rPr>
+        <w:t xml:space="preserve">Definition of Done = the gates are green</w:t>
+      </w:r>
+      <w:r>
+        <w:t xml:space="preserve"> </w:t>
+      </w:r>
+      <w:r>
+        <w:t xml:space="preserve">(DQ, verify, readiness).</w:t>
+      </w:r>
+    </w:p>
+    <w:p>
+      <w:pPr>
+        <w:pStyle w:val="BodyText"/>
+      </w:pPr>
+      <w:r>
+        <w:t xml:space="preserve">The four rules that keep three people aligned:</w:t>
+      </w:r>
+      <w:r>
+        <w:t xml:space="preserve"> </w:t>
+      </w:r>
+      <w:r>
+        <w:rPr>
+          <w:b/>
+        </w:rPr>
+        <w:t xml:space="preserve">decide by citation</w:t>
+      </w:r>
+      <w:r>
+        <w:t xml:space="preserve"> </w:t>
+      </w:r>
+      <w:r>
+        <w:t xml:space="preserve">(principles/ADRs),</w:t>
+      </w:r>
+      <w:r>
+        <w:t xml:space="preserve"> </w:t>
+      </w:r>
+      <w:r>
+        <w:rPr>
+          <w:b/>
+        </w:rPr>
+        <w:t xml:space="preserve">generate —</w:t>
+      </w:r>
+      <w:r>
+        <w:rPr>
+          <w:b/>
+        </w:rPr>
+        <w:t xml:space="preserve"> </w:t>
+      </w:r>
+      <w:r>
+        <w:rPr>
+          <w:b/>
+        </w:rPr>
+        <w:t xml:space="preserve">never hand-edit</w:t>
+      </w:r>
+      <w:r>
+        <w:t xml:space="preserve">,</w:t>
+      </w:r>
+      <w:r>
+        <w:t xml:space="preserve"> </w:t>
+      </w:r>
+      <w:r>
+        <w:rPr>
+          <w:b/>
+        </w:rPr>
+        <w:t xml:space="preserve">one definition per fact</w:t>
+      </w:r>
+      <w:r>
+        <w:t xml:space="preserve"> </w:t>
+      </w:r>
+      <w:r>
+        <w:t xml:space="preserve">(pull from Gold), and</w:t>
+      </w:r>
+      <w:r>
+        <w:t xml:space="preserve"> </w:t>
+      </w:r>
+      <w:r>
+        <w:rPr>
+          <w:b/>
+        </w:rPr>
+        <w:t xml:space="preserve">peer-reviewed PRs through CI</w:t>
+      </w:r>
+      <w:r>
+        <w:t xml:space="preserve">.</w:t>
+      </w:r>
+      <w:r>
+        <w:t xml:space="preserve"> </w:t>
+      </w:r>
+      <w:r>
+        <w:t xml:space="preserve">Rotate the roles so all three can do every part by the end.</w:t>
+      </w:r>
+    </w:p>
+    <w:p>
+      <w:pPr>
+        <w:pStyle w:val="Heading3"/>
+      </w:pPr>
+      <w:bookmarkStart w:id="40" w:name="daily-rhythm"/>
+      <w:r>
+        <w:t xml:space="preserve">Daily rhythm</w:t>
+      </w:r>
+      <w:bookmarkEnd w:id="40"/>
     </w:p>
     <w:p>
       <w:pPr>
         <w:numPr>
           <w:ilvl w:val="0"/>
-          <w:numId w:val="1026"/>
+          <w:numId w:val="1029"/>
         </w:numPr>
         <w:pStyle w:val="Compact"/>
       </w:pPr>
@@ -6530,64 +7102,136 @@
         <w:rPr>
           <w:b/>
         </w:rPr>
-        <w:t xml:space="preserve">“</w:t>
-      </w:r>
-      <w:r>
-        <w:rPr>
-          <w:b/>
-        </w:rPr>
-        <w:t xml:space="preserve">Should we use</w:t>
-      </w:r>
-      <w:r>
-        <w:rPr>
-          <w:b/>
-        </w:rPr>
-        <w:t xml:space="preserve"> </w:t>
-      </w:r>
-      <w:r>
-        <w:rPr>
-          <w:b/>
-        </w:rPr>
-        <w:t xml:space="preserve"> </w:t>
-      </w:r>
-      <w:r>
-        <w:rPr>
-          <w:b/>
-        </w:rPr>
-        <w:t xml:space="preserve">for Y?</w:t>
-      </w:r>
-      <w:r>
-        <w:rPr>
-          <w:b/>
-        </w:rPr>
-        <w:t xml:space="preserve">”</w:t>
-      </w:r>
-      <w:r>
-        <w:t xml:space="preserve"> </w:t>
-      </w:r>
-      <w:r>
-        <w:t xml:space="preserve">Ask</w:t>
-      </w:r>
-      <w:r>
-        <w:t xml:space="preserve"> </w:t>
-      </w:r>
-      <w:r>
-        <w:rPr>
-          <w:rStyle w:val="VerbatimChar"/>
-        </w:rPr>
-        <w:t xml:space="preserve">mtca-architecture-principles</w:t>
-      </w:r>
-      <w:r>
-        <w:t xml:space="preserve"> </w:t>
-      </w:r>
-      <w:r>
-        <w:t xml:space="preserve">— most such</w:t>
-      </w:r>
-      <w:r>
-        <w:t xml:space="preserve"> </w:t>
-      </w:r>
-      <w:r>
-        <w:t xml:space="preserve">questions are already settled by a principle; record the decision as an ADR.</w:t>
+        <w:t xml:space="preserve">Pick the next slice</w:t>
+      </w:r>
+      <w:r>
+        <w:t xml:space="preserve"> </w:t>
+      </w:r>
+      <w:r>
+        <w:t xml:space="preserve">(a source, a mart, a dashboard) from the backlog.</w:t>
+      </w:r>
+    </w:p>
+    <w:p>
+      <w:pPr>
+        <w:numPr>
+          <w:ilvl w:val="0"/>
+          <w:numId w:val="1029"/>
+        </w:numPr>
+        <w:pStyle w:val="Compact"/>
+      </w:pPr>
+      <w:r>
+        <w:rPr>
+          <w:b/>
+        </w:rPr>
+        <w:t xml:space="preserve">Decide the track</w:t>
+      </w:r>
+      <w:r>
+        <w:t xml:space="preserve">: generate in Cowork (Track A); run dbt/loads/imports and commit on your</w:t>
+      </w:r>
+      <w:r>
+        <w:t xml:space="preserve"> </w:t>
+      </w:r>
+      <w:r>
+        <w:t xml:space="preserve">workstation (Track B). Ask</w:t>
+      </w:r>
+      <w:r>
+        <w:t xml:space="preserve"> </w:t>
+      </w:r>
+      <w:r>
+        <w:rPr>
+          <w:rStyle w:val="VerbatimChar"/>
+        </w:rPr>
+        <w:t xml:space="preserve">mtca-dev-workflow</w:t>
+      </w:r>
+      <w:r>
+        <w:t xml:space="preserve"> </w:t>
+      </w:r>
+      <w:r>
+        <w:t xml:space="preserve">if unsure.</w:t>
+      </w:r>
+    </w:p>
+    <w:p>
+      <w:pPr>
+        <w:numPr>
+          <w:ilvl w:val="0"/>
+          <w:numId w:val="1029"/>
+        </w:numPr>
+        <w:pStyle w:val="Compact"/>
+      </w:pPr>
+      <w:r>
+        <w:rPr>
+          <w:b/>
+        </w:rPr>
+        <w:t xml:space="preserve">Use the skill, don’t free-hand</w:t>
+      </w:r>
+      <w:r>
+        <w:t xml:space="preserve">: say what you want; review the generated spec/output; fill any</w:t>
+      </w:r>
+      <w:r>
+        <w:t xml:space="preserve"> </w:t>
+      </w:r>
+      <w:r>
+        <w:rPr>
+          <w:rStyle w:val="VerbatimChar"/>
+        </w:rPr>
+        <w:t xml:space="preserve">TODO</w:t>
+      </w:r>
+      <w:r>
+        <w:t xml:space="preserve">/DRAFT; run it live;</w:t>
+      </w:r>
+      <w:r>
+        <w:t xml:space="preserve"> </w:t>
+      </w:r>
+      <w:r>
+        <w:rPr>
+          <w:b/>
+        </w:rPr>
+        <w:t xml:space="preserve">commit</w:t>
+      </w:r>
+      <w:r>
+        <w:t xml:space="preserve">.</w:t>
+      </w:r>
+    </w:p>
+    <w:p>
+      <w:pPr>
+        <w:numPr>
+          <w:ilvl w:val="0"/>
+          <w:numId w:val="1029"/>
+        </w:numPr>
+        <w:pStyle w:val="Compact"/>
+      </w:pPr>
+      <w:r>
+        <w:rPr>
+          <w:b/>
+        </w:rPr>
+        <w:t xml:space="preserve">Pair</w:t>
+      </w:r>
+      <w:r>
+        <w:t xml:space="preserve">: shadow → pair → lead. The first time on each skill, pair with the STX/contractor; then the</w:t>
+      </w:r>
+      <w:r>
+        <w:t xml:space="preserve"> </w:t>
+      </w:r>
+      <w:r>
+        <w:t xml:space="preserve">team leads. The skill is the script for this.</w:t>
+      </w:r>
+    </w:p>
+    <w:p>
+      <w:pPr>
+        <w:numPr>
+          <w:ilvl w:val="0"/>
+          <w:numId w:val="1029"/>
+        </w:numPr>
+        <w:pStyle w:val="Compact"/>
+      </w:pPr>
+      <w:r>
+        <w:rPr>
+          <w:b/>
+        </w:rPr>
+        <w:t xml:space="preserve">Close the loop</w:t>
+      </w:r>
+      <w:r>
+        <w:t xml:space="preserve">: run the relevant gate (DQ, verify, readiness) before calling it done.</w:t>
       </w:r>
     </w:p>
     <w:p>
@@ -6601,11 +7245,545 @@
       <w:pPr>
         <w:pStyle w:val="Heading2"/>
       </w:pPr>
-      <w:bookmarkStart w:id="41" w:name="quick-reference"/>
+      <w:bookmarkStart w:id="41" w:name="troubleshooting-faq"/>
+      <w:r>
+        <w:t xml:space="preserve">10. Troubleshooting &amp; FAQ</w:t>
+      </w:r>
+      <w:bookmarkEnd w:id="41"/>
+    </w:p>
+    <w:p>
+      <w:pPr>
+        <w:numPr>
+          <w:ilvl w:val="0"/>
+          <w:numId w:val="1030"/>
+        </w:numPr>
+        <w:pStyle w:val="Compact"/>
+      </w:pPr>
+      <w:r>
+        <w:rPr>
+          <w:b/>
+        </w:rPr>
+        <w:t xml:space="preserve">“</w:t>
+      </w:r>
+      <w:r>
+        <w:rPr>
+          <w:b/>
+        </w:rPr>
+        <w:t xml:space="preserve">dbt didn’t run in Cowork.</w:t>
+      </w:r>
+      <w:r>
+        <w:rPr>
+          <w:b/>
+        </w:rPr>
+        <w:t xml:space="preserve">”</w:t>
+      </w:r>
+      <w:r>
+        <w:t xml:space="preserve"> </w:t>
+      </w:r>
+      <w:r>
+        <w:t xml:space="preserve">Correct — that’s Track B. Cowork</w:t>
+      </w:r>
+      <w:r>
+        <w:t xml:space="preserve"> </w:t>
+      </w:r>
+      <w:r>
+        <w:rPr>
+          <w:i/>
+        </w:rPr>
+        <w:t xml:space="preserve">generates</w:t>
+      </w:r>
+      <w:r>
+        <w:t xml:space="preserve"> </w:t>
+      </w:r>
+      <w:r>
+        <w:t xml:space="preserve">the models; you run</w:t>
+      </w:r>
+      <w:r>
+        <w:t xml:space="preserve"> </w:t>
+      </w:r>
+      <w:r>
+        <w:rPr>
+          <w:rStyle w:val="VerbatimChar"/>
+        </w:rPr>
+        <w:t xml:space="preserve">dbt build</w:t>
+      </w:r>
+      <w:r>
+        <w:t xml:space="preserve"> </w:t>
+      </w:r>
+      <w:r>
+        <w:t xml:space="preserve">on your workstation/stack. (</w:t>
+      </w:r>
+      <w:r>
+        <w:rPr>
+          <w:rStyle w:val="VerbatimChar"/>
+        </w:rPr>
+        <w:t xml:space="preserve">mtca-dev-workflow</w:t>
+      </w:r>
+      <w:r>
+        <w:t xml:space="preserve">.)</w:t>
+      </w:r>
+    </w:p>
+    <w:p>
+      <w:pPr>
+        <w:numPr>
+          <w:ilvl w:val="0"/>
+          <w:numId w:val="1030"/>
+        </w:numPr>
+        <w:pStyle w:val="Compact"/>
+      </w:pPr>
+      <w:r>
+        <w:rPr>
+          <w:b/>
+        </w:rPr>
+        <w:t xml:space="preserve">“</w:t>
+      </w:r>
+      <w:r>
+        <w:rPr>
+          <w:b/>
+        </w:rPr>
+        <w:t xml:space="preserve">git says</w:t>
+      </w:r>
+      <w:r>
+        <w:rPr>
+          <w:b/>
+        </w:rPr>
+        <w:t xml:space="preserve"> </w:t>
+      </w:r>
+      <w:r>
+        <w:rPr>
+          <w:rStyle w:val="VerbatimChar"/>
+          <w:b/>
+        </w:rPr>
+        <w:t xml:space="preserve">index.lock</w:t>
+      </w:r>
+      <w:r>
+        <w:rPr>
+          <w:b/>
+        </w:rPr>
+        <w:t xml:space="preserve"> </w:t>
+      </w:r>
+      <w:r>
+        <w:rPr>
+          <w:b/>
+        </w:rPr>
+        <w:t xml:space="preserve">exists / can’t commit.</w:t>
+      </w:r>
+      <w:r>
+        <w:rPr>
+          <w:b/>
+        </w:rPr>
+        <w:t xml:space="preserve">”</w:t>
+      </w:r>
+      <w:r>
+        <w:t xml:space="preserve"> </w:t>
+      </w:r>
+      <w:r>
+        <w:t xml:space="preserve">A git command was run inside the Cowork sandbox,</w:t>
+      </w:r>
+      <w:r>
+        <w:t xml:space="preserve"> </w:t>
+      </w:r>
+      <w:r>
+        <w:t xml:space="preserve">which can’t clean up its lock files. Run git</w:t>
+      </w:r>
+      <w:r>
+        <w:t xml:space="preserve"> </w:t>
+      </w:r>
+      <w:r>
+        <w:rPr>
+          <w:b/>
+        </w:rPr>
+        <w:t xml:space="preserve">on your workstation</w:t>
+      </w:r>
+      <w:r>
+        <w:t xml:space="preserve">; if locks are stranded, delete</w:t>
+      </w:r>
+      <w:r>
+        <w:t xml:space="preserve"> </w:t>
+      </w:r>
+      <w:r>
+        <w:rPr>
+          <w:rStyle w:val="VerbatimChar"/>
+        </w:rPr>
+        <w:t xml:space="preserve">.git/index.lock</w:t>
+      </w:r>
+      <w:r>
+        <w:t xml:space="preserve"> </w:t>
+      </w:r>
+      <w:r>
+        <w:t xml:space="preserve">(see</w:t>
+      </w:r>
+      <w:r>
+        <w:t xml:space="preserve"> </w:t>
+      </w:r>
+      <w:r>
+        <w:rPr>
+          <w:rStyle w:val="VerbatimChar"/>
+        </w:rPr>
+        <w:t xml:space="preserve">repo-scaffold/references/git-on-the-workstation.md</w:t>
+      </w:r>
+      <w:r>
+        <w:t xml:space="preserve">).</w:t>
+      </w:r>
+    </w:p>
+    <w:p>
+      <w:pPr>
+        <w:numPr>
+          <w:ilvl w:val="0"/>
+          <w:numId w:val="1030"/>
+        </w:numPr>
+        <w:pStyle w:val="Compact"/>
+      </w:pPr>
+      <w:r>
+        <w:rPr>
+          <w:b/>
+        </w:rPr>
+        <w:t xml:space="preserve">“</w:t>
+      </w:r>
+      <w:r>
+        <w:rPr>
+          <w:b/>
+        </w:rPr>
+        <w:t xml:space="preserve">The script left files inside the skill folder.</w:t>
+      </w:r>
+      <w:r>
+        <w:rPr>
+          <w:b/>
+        </w:rPr>
+        <w:t xml:space="preserve">”</w:t>
+      </w:r>
+      <w:r>
+        <w:t xml:space="preserve"> </w:t>
+      </w:r>
+      <w:r>
+        <w:t xml:space="preserve">Point</w:t>
+      </w:r>
+      <w:r>
+        <w:t xml:space="preserve"> </w:t>
+      </w:r>
+      <w:r>
+        <w:rPr>
+          <w:rStyle w:val="VerbatimChar"/>
+        </w:rPr>
+        <w:t xml:space="preserve">--out</w:t>
+      </w:r>
+      <w:r>
+        <w:t xml:space="preserve">/</w:t>
+      </w:r>
+      <w:r>
+        <w:rPr>
+          <w:rStyle w:val="VerbatimChar"/>
+        </w:rPr>
+        <w:t xml:space="preserve">--repo</w:t>
+      </w:r>
+      <w:r>
+        <w:t xml:space="preserve"> </w:t>
+      </w:r>
+      <w:r>
+        <w:t xml:space="preserve">at your repo’s workspace</w:t>
+      </w:r>
+      <w:r>
+        <w:t xml:space="preserve"> </w:t>
+      </w:r>
+      <w:r>
+        <w:t xml:space="preserve">(e.g. </w:t>
+      </w:r>
+      <w:r>
+        <w:rPr>
+          <w:rStyle w:val="VerbatimChar"/>
+        </w:rPr>
+        <w:t xml:space="preserve">catalogue/module-semantics/</w:t>
+      </w:r>
+      <w:r>
+        <w:t xml:space="preserve">), not the skill directory.</w:t>
+      </w:r>
+    </w:p>
+    <w:p>
+      <w:pPr>
+        <w:numPr>
+          <w:ilvl w:val="0"/>
+          <w:numId w:val="1030"/>
+        </w:numPr>
+        <w:pStyle w:val="Compact"/>
+      </w:pPr>
+      <w:r>
+        <w:rPr>
+          <w:b/>
+        </w:rPr>
+        <w:t xml:space="preserve">“</w:t>
+      </w:r>
+      <w:r>
+        <w:rPr>
+          <w:b/>
+        </w:rPr>
+        <w:t xml:space="preserve">A YAML-spec skill says</w:t>
+      </w:r>
+      <w:r>
+        <w:rPr>
+          <w:b/>
+        </w:rPr>
+        <w:t xml:space="preserve"> </w:t>
+      </w:r>
+      <w:r>
+        <w:rPr>
+          <w:b/>
+        </w:rPr>
+        <w:t xml:space="preserve">‘</w:t>
+      </w:r>
+      <w:r>
+        <w:rPr>
+          <w:b/>
+        </w:rPr>
+        <w:t xml:space="preserve">install pyyaml</w:t>
+      </w:r>
+      <w:r>
+        <w:rPr>
+          <w:b/>
+        </w:rPr>
+        <w:t xml:space="preserve">’</w:t>
+      </w:r>
+      <w:r>
+        <w:rPr>
+          <w:b/>
+        </w:rPr>
+        <w:t xml:space="preserve">.</w:t>
+      </w:r>
+      <w:r>
+        <w:rPr>
+          <w:b/>
+        </w:rPr>
+        <w:t xml:space="preserve">”</w:t>
+      </w:r>
+      <w:r>
+        <w:t xml:space="preserve"> </w:t>
+      </w:r>
+      <w:r>
+        <w:t xml:space="preserve">Install PyYAML (</w:t>
+      </w:r>
+      <w:r>
+        <w:rPr>
+          <w:rStyle w:val="VerbatimChar"/>
+        </w:rPr>
+        <w:t xml:space="preserve">pip install pyyaml</w:t>
+      </w:r>
+      <w:r>
+        <w:t xml:space="preserve">, or</w:t>
+      </w:r>
+      <w:r>
+        <w:t xml:space="preserve"> </w:t>
+      </w:r>
+      <w:r>
+        <w:rPr>
+          <w:rStyle w:val="VerbatimChar"/>
+        </w:rPr>
+        <w:t xml:space="preserve">python tasks.py setup</w:t>
+      </w:r>
+      <w:r>
+        <w:t xml:space="preserve">). The spec-reading skills need it.</w:t>
+      </w:r>
+    </w:p>
+    <w:p>
+      <w:pPr>
+        <w:numPr>
+          <w:ilvl w:val="0"/>
+          <w:numId w:val="1030"/>
+        </w:numPr>
+        <w:pStyle w:val="Compact"/>
+      </w:pPr>
+      <w:r>
+        <w:rPr>
+          <w:b/>
+        </w:rPr>
+        <w:t xml:space="preserve">“</w:t>
+      </w:r>
+      <w:r>
+        <w:rPr>
+          <w:b/>
+        </w:rPr>
+        <w:t xml:space="preserve">The accuracy DQ test passes but we never wrote the reconciliation.</w:t>
+      </w:r>
+      <w:r>
+        <w:rPr>
+          <w:b/>
+        </w:rPr>
+        <w:t xml:space="preserve">”</w:t>
+      </w:r>
+      <w:r>
+        <w:t xml:space="preserve"> </w:t>
+      </w:r>
+      <w:r>
+        <w:t xml:space="preserve">That’s the deliberate</w:t>
+      </w:r>
+      <w:r>
+        <w:t xml:space="preserve"> </w:t>
+      </w:r>
+      <w:r>
+        <w:t xml:space="preserve">stub — accuracy is an</w:t>
+      </w:r>
+      <w:r>
+        <w:t xml:space="preserve"> </w:t>
+      </w:r>
+      <w:r>
+        <w:rPr>
+          <w:b/>
+        </w:rPr>
+        <w:t xml:space="preserve">open control</w:t>
+      </w:r>
+      <w:r>
+        <w:t xml:space="preserve"> </w:t>
+      </w:r>
+      <w:r>
+        <w:t xml:space="preserve">until you implement the real cross-source check; don’t read</w:t>
+      </w:r>
+      <w:r>
+        <w:t xml:space="preserve"> </w:t>
+      </w:r>
+      <w:r>
+        <w:t xml:space="preserve">the green as done.</w:t>
+      </w:r>
+    </w:p>
+    <w:p>
+      <w:pPr>
+        <w:numPr>
+          <w:ilvl w:val="0"/>
+          <w:numId w:val="1030"/>
+        </w:numPr>
+        <w:pStyle w:val="Compact"/>
+      </w:pPr>
+      <w:r>
+        <w:rPr>
+          <w:b/>
+        </w:rPr>
+        <w:t xml:space="preserve">“</w:t>
+      </w:r>
+      <w:r>
+        <w:rPr>
+          <w:b/>
+        </w:rPr>
+        <w:t xml:space="preserve">A description is unclear.</w:t>
+      </w:r>
+      <w:r>
+        <w:rPr>
+          <w:b/>
+        </w:rPr>
+        <w:t xml:space="preserve">”</w:t>
+      </w:r>
+      <w:r>
+        <w:t xml:space="preserve"> </w:t>
+      </w:r>
+      <w:r>
+        <w:t xml:space="preserve">Mark it</w:t>
+      </w:r>
+      <w:r>
+        <w:t xml:space="preserve"> </w:t>
+      </w:r>
+      <w:r>
+        <w:rPr>
+          <w:rStyle w:val="VerbatimChar"/>
+        </w:rPr>
+        <w:t xml:space="preserve">to_confirm</w:t>
+      </w:r>
+      <w:r>
+        <w:t xml:space="preserve"> </w:t>
+      </w:r>
+      <w:r>
+        <w:t xml:space="preserve">(not a guess) and resolve it with the Data</w:t>
+      </w:r>
+      <w:r>
+        <w:t xml:space="preserve"> </w:t>
+      </w:r>
+      <w:r>
+        <w:t xml:space="preserve">Owner; the verify gate keeps DRAFT meaning out of marts.</w:t>
+      </w:r>
+    </w:p>
+    <w:p>
+      <w:pPr>
+        <w:numPr>
+          <w:ilvl w:val="0"/>
+          <w:numId w:val="1030"/>
+        </w:numPr>
+        <w:pStyle w:val="Compact"/>
+      </w:pPr>
+      <w:r>
+        <w:rPr>
+          <w:b/>
+        </w:rPr>
+        <w:t xml:space="preserve">“</w:t>
+      </w:r>
+      <w:r>
+        <w:rPr>
+          <w:b/>
+        </w:rPr>
+        <w:t xml:space="preserve">Should we use</w:t>
+      </w:r>
+      <w:r>
+        <w:rPr>
+          <w:b/>
+        </w:rPr>
+        <w:t xml:space="preserve"> </w:t>
+      </w:r>
+      <w:r>
+        <w:rPr>
+          <w:b/>
+        </w:rPr>
+        <w:t xml:space="preserve"> </w:t>
+      </w:r>
+      <w:r>
+        <w:rPr>
+          <w:b/>
+        </w:rPr>
+        <w:t xml:space="preserve">for Y?</w:t>
+      </w:r>
+      <w:r>
+        <w:rPr>
+          <w:b/>
+        </w:rPr>
+        <w:t xml:space="preserve">”</w:t>
+      </w:r>
+      <w:r>
+        <w:t xml:space="preserve"> </w:t>
+      </w:r>
+      <w:r>
+        <w:t xml:space="preserve">Ask</w:t>
+      </w:r>
+      <w:r>
+        <w:t xml:space="preserve"> </w:t>
+      </w:r>
+      <w:r>
+        <w:rPr>
+          <w:rStyle w:val="VerbatimChar"/>
+        </w:rPr>
+        <w:t xml:space="preserve">mtca-architecture-principles</w:t>
+      </w:r>
+      <w:r>
+        <w:t xml:space="preserve"> </w:t>
+      </w:r>
+      <w:r>
+        <w:t xml:space="preserve">— most such</w:t>
+      </w:r>
+      <w:r>
+        <w:t xml:space="preserve"> </w:t>
+      </w:r>
+      <w:r>
+        <w:t xml:space="preserve">questions are already settled by a principle; record the decision as an ADR.</w:t>
+      </w:r>
+    </w:p>
+    <w:p>
+      <w:r>
+        <w:pict>
+          <v:rect style="width:0;height:1.5pt" o:hralign="center" o:hrstd="t" o:hr="t"/>
+        </w:pict>
+      </w:r>
+    </w:p>
+    <w:p>
+      <w:pPr>
+        <w:pStyle w:val="Heading2"/>
+      </w:pPr>
+      <w:bookmarkStart w:id="42" w:name="quick-reference"/>
       <w:r>
         <w:t xml:space="preserve">11. Quick reference</w:t>
       </w:r>
-      <w:bookmarkEnd w:id="41"/>
+      <w:bookmarkEnd w:id="42"/>
     </w:p>
     <w:p>
       <w:pPr>
@@ -7034,7 +8212,7 @@
       <w:pPr>
         <w:numPr>
           <w:ilvl w:val="0"/>
-          <w:numId w:val="1027"/>
+          <w:numId w:val="1031"/>
         </w:numPr>
         <w:pStyle w:val="Compact"/>
       </w:pPr>
@@ -7070,7 +8248,7 @@
       <w:pPr>
         <w:numPr>
           <w:ilvl w:val="0"/>
-          <w:numId w:val="1027"/>
+          <w:numId w:val="1031"/>
         </w:numPr>
         <w:pStyle w:val="Compact"/>
       </w:pPr>
@@ -7091,7 +8269,7 @@
       <w:pPr>
         <w:numPr>
           <w:ilvl w:val="0"/>
-          <w:numId w:val="1027"/>
+          <w:numId w:val="1031"/>
         </w:numPr>
         <w:pStyle w:val="Compact"/>
       </w:pPr>
@@ -7112,7 +8290,7 @@
       <w:pPr>
         <w:numPr>
           <w:ilvl w:val="0"/>
-          <w:numId w:val="1027"/>
+          <w:numId w:val="1031"/>
         </w:numPr>
         <w:pStyle w:val="Compact"/>
       </w:pPr>
@@ -7807,6 +8985,18 @@
     <w:abstractNumId w:val="991"/>
   </w:num>
   <w:num w:numId="1027">
+    <w:abstractNumId w:val="991"/>
+  </w:num>
+  <w:num w:numId="1028">
+    <w:abstractNumId w:val="991"/>
+  </w:num>
+  <w:num w:numId="1029">
+    <w:abstractNumId w:val="991"/>
+  </w:num>
+  <w:num w:numId="1030">
+    <w:abstractNumId w:val="991"/>
+  </w:num>
+  <w:num w:numId="1031">
     <w:abstractNumId w:val="991"/>
   </w:num>
 </w:numbering>

</xml_diff>

<commit_message>
Guide §9: make domain ownership the standing team model (team already splits by domain)
Each developer owns a domain end-to-end through the whole loop; the shared cross-domain core
(Taxpayer-360 golden record, shared metrics/vocabularies, conventions, main) gets one rotating
platform steward; domain owners compose from it and change it only by PR. Regenerated the .docx.
</commit_message>
<xml_diff>
--- a/docs/MTCA_DataPlatform_Developers_Guide.docx
+++ b/docs/MTCA_DataPlatform_Developers_Guide.docx
@@ -6306,16 +6306,97 @@
         <w:rPr>
           <w:b/>
         </w:rPr>
-        <w:t xml:space="preserve">Split by vertical ownership, not by horizontal layer.</w:t>
-      </w:r>
-      <w:r>
-        <w:t xml:space="preserve"> </w:t>
-      </w:r>
-      <w:r>
-        <w:t xml:space="preserve">Don’t have one person do</w:t>
-      </w:r>
-      <w:r>
-        <w:t xml:space="preserve"> </w:t>
+        <w:t xml:space="preserve">Keep your domain ownership — own a domain end-to-end.</w:t>
+      </w:r>
+      <w:r>
+        <w:t xml:space="preserve"> </w:t>
+      </w:r>
+      <w:r>
+        <w:t xml:space="preserve">The team already splits responsibility by</w:t>
+      </w:r>
+      <w:r>
+        <w:t xml:space="preserve"> </w:t>
+      </w:r>
+      <w:r>
+        <w:rPr>
+          <w:b/>
+        </w:rPr>
+        <w:t xml:space="preserve">domain</w:t>
+      </w:r>
+      <w:r>
+        <w:t xml:space="preserve"> </w:t>
+      </w:r>
+      <w:r>
+        <w:t xml:space="preserve">(e.g. one developer for income tax / IRD, one for VAT, one for customs/excise), and that is</w:t>
+      </w:r>
+      <w:r>
+        <w:t xml:space="preserve"> </w:t>
+      </w:r>
+      <w:r>
+        <w:t xml:space="preserve">the right model — keep it. Each developer carries their domain through the</w:t>
+      </w:r>
+      <w:r>
+        <w:t xml:space="preserve"> </w:t>
+      </w:r>
+      <w:r>
+        <w:rPr>
+          <w:b/>
+        </w:rPr>
+        <w:t xml:space="preserve">whole loop</w:t>
+      </w:r>
+      <w:r>
+        <w:t xml:space="preserve">: onboard its</w:t>
+      </w:r>
+      <w:r>
+        <w:t xml:space="preserve"> </w:t>
+      </w:r>
+      <w:r>
+        <w:t xml:space="preserve">sources → model</w:t>
+      </w:r>
+      <w:r>
+        <w:t xml:space="preserve"> </w:t>
+      </w:r>
+      <w:r>
+        <w:rPr>
+          <w:rStyle w:val="VerbatimChar"/>
+        </w:rPr>
+        <w:t xml:space="preserve">stg_</w:t>
+      </w:r>
+      <w:r>
+        <w:t xml:space="preserve">/</w:t>
+      </w:r>
+      <w:r>
+        <w:rPr>
+          <w:rStyle w:val="VerbatimChar"/>
+        </w:rPr>
+        <w:t xml:space="preserve">int_</w:t>
+      </w:r>
+      <w:r>
+        <w:t xml:space="preserve">/</w:t>
+      </w:r>
+      <w:r>
+        <w:rPr>
+          <w:rStyle w:val="VerbatimChar"/>
+        </w:rPr>
+        <w:t xml:space="preserve">mart_</w:t>
+      </w:r>
+      <w:r>
+        <w:t xml:space="preserve"> </w:t>
+      </w:r>
+      <w:r>
+        <w:t xml:space="preserve">→ DQ → catalogue &amp; verify → expose the surface → gate. Vertical,</w:t>
+      </w:r>
+      <w:r>
+        <w:t xml:space="preserve"> </w:t>
+      </w:r>
+      <w:r>
+        <w:t xml:space="preserve">end-to-end ownership means few hand-offs and one clear owner per slice — far better than splitting by</w:t>
+      </w:r>
+      <w:r>
+        <w:t xml:space="preserve"> </w:t>
+      </w:r>
+      <w:r>
+        <w:t xml:space="preserve">layer (</w:t>
       </w:r>
       <w:r>
         <w:t xml:space="preserve">“</w:t>
@@ -6330,13 +6411,7 @@
         <w:t xml:space="preserve"> </w:t>
       </w:r>
       <w:r>
-        <w:t xml:space="preserve">and</w:t>
-      </w:r>
-      <w:r>
-        <w:t xml:space="preserve"> </w:t>
-      </w:r>
-      <w:r>
-        <w:t xml:space="preserve">another</w:t>
+        <w:t xml:space="preserve">vs</w:t>
       </w:r>
       <w:r>
         <w:t xml:space="preserve"> </w:t>
@@ -6351,10 +6426,7 @@
         <w:t xml:space="preserve">”</w:t>
       </w:r>
       <w:r>
-        <w:t xml:space="preserve"> </w:t>
-      </w:r>
-      <w:r>
-        <w:t xml:space="preserve">— that creates wait-chains and blurred ownership. Instead:</w:t>
+        <w:t xml:space="preserve">), which creates wait-chains and blurred ownership.</w:t>
       </w:r>
     </w:p>
     <w:p>
@@ -6369,52 +6441,46 @@
         <w:rPr>
           <w:b/>
         </w:rPr>
-        <w:t xml:space="preserve">The first (Debt) slice: build it together.</w:t>
-      </w:r>
-      <w:r>
-        <w:t xml:space="preserve"> </w:t>
-      </w:r>
-      <w:r>
-        <w:t xml:space="preserve">One developer drives, the other two review,</w:t>
-      </w:r>
-      <w:r>
-        <w:t xml:space="preserve"> </w:t>
-      </w:r>
-      <w:r>
-        <w:rPr>
-          <w:b/>
-        </w:rPr>
-        <w:t xml:space="preserve">rotating</w:t>
-      </w:r>
-      <w:r>
-        <w:rPr>
-          <w:b/>
-        </w:rPr>
-        <w:t xml:space="preserve"> </w:t>
-      </w:r>
-      <w:r>
-        <w:rPr>
-          <w:b/>
-        </w:rPr>
-        <w:t xml:space="preserve">the keyboard per milestone</w:t>
-      </w:r>
-      <w:r>
-        <w:t xml:space="preserve"> </w:t>
-      </w:r>
-      <w:r>
-        <w:t xml:space="preserve">(M1 ingestion → M2/M3 modelling → M4/M5 consumption → M6 go-live). Everyone</w:t>
-      </w:r>
-      <w:r>
-        <w:t xml:space="preserve"> </w:t>
-      </w:r>
-      <w:r>
-        <w:t xml:space="preserve">sees the whole path once. This is the shadow → pair → lead start, and it sets the patterns the rest of</w:t>
-      </w:r>
-      <w:r>
-        <w:t xml:space="preserve"> </w:t>
-      </w:r>
-      <w:r>
-        <w:t xml:space="preserve">the work copies.</w:t>
+        <w:t xml:space="preserve">Build the first Debt slice together first.</w:t>
+      </w:r>
+      <w:r>
+        <w:t xml:space="preserve"> </w:t>
+      </w:r>
+      <w:r>
+        <w:t xml:space="preserve">Before splitting fully, build one slice as a team —</w:t>
+      </w:r>
+      <w:r>
+        <w:t xml:space="preserve"> </w:t>
+      </w:r>
+      <w:r>
+        <w:t xml:space="preserve">one developer drives, the other two review,</w:t>
+      </w:r>
+      <w:r>
+        <w:t xml:space="preserve"> </w:t>
+      </w:r>
+      <w:r>
+        <w:rPr>
+          <w:b/>
+        </w:rPr>
+        <w:t xml:space="preserve">rotating the keyboard per milestone</w:t>
+      </w:r>
+      <w:r>
+        <w:t xml:space="preserve"> </w:t>
+      </w:r>
+      <w:r>
+        <w:t xml:space="preserve">(M1 ingestion →</w:t>
+      </w:r>
+      <w:r>
+        <w:t xml:space="preserve"> </w:t>
+      </w:r>
+      <w:r>
+        <w:t xml:space="preserve">M2/M3 modelling → M4/M5 consumption → M6 go-live). Everyone sees the whole path once; this is the</w:t>
+      </w:r>
+      <w:r>
+        <w:t xml:space="preserve"> </w:t>
+      </w:r>
+      <w:r>
+        <w:t xml:space="preserve">shadow → pair → lead start, and it sets the patterns each domain then copies.</w:t>
       </w:r>
     </w:p>
     <w:p>
@@ -6429,238 +6495,427 @@
         <w:rPr>
           <w:b/>
         </w:rPr>
-        <w:t xml:space="preserve">After the patterns are proven: parallelise by ownership.</w:t>
-      </w:r>
-      <w:r>
-        <w:t xml:space="preserve"> </w:t>
-      </w:r>
-      <w:r>
-        <w:t xml:space="preserve">Two workable splits:</w:t>
+        <w:t xml:space="preserve">Then run domains in parallel</w:t>
+      </w:r>
+      <w:r>
+        <w:t xml:space="preserve"> </w:t>
+      </w:r>
+      <w:r>
+        <w:t xml:space="preserve">— each owner builds their domain with the same skills, conventions</w:t>
+      </w:r>
+      <w:r>
+        <w:t xml:space="preserve"> </w:t>
+      </w:r>
+      <w:r>
+        <w:t xml:space="preserve">and gates, so the outputs match by construction.</w:t>
+      </w:r>
+    </w:p>
+    <w:p>
+      <w:pPr>
+        <w:pStyle w:val="FirstParagraph"/>
+      </w:pPr>
+      <w:r>
+        <w:rPr>
+          <w:b/>
+        </w:rPr>
+        <w:t xml:space="preserve">The real consistency risk with a domain split is the shared, cross-domain core — give it one owner.</w:t>
+      </w:r>
+      <w:r>
+        <w:t xml:space="preserve"> </w:t>
+      </w:r>
+      <w:r>
+        <w:t xml:space="preserve">Some things are not owned by any single domain because every domain uses them: the</w:t>
+      </w:r>
+      <w:r>
+        <w:t xml:space="preserve"> </w:t>
+      </w:r>
+      <w:r>
+        <w:rPr>
+          <w:b/>
+        </w:rPr>
+        <w:t xml:space="preserve">Taxpayer-360</w:t>
+      </w:r>
+      <w:r>
+        <w:rPr>
+          <w:b/>
+        </w:rPr>
+        <w:t xml:space="preserve"> </w:t>
+      </w:r>
+      <w:r>
+        <w:rPr>
+          <w:b/>
+        </w:rPr>
+        <w:t xml:space="preserve">golden record</w:t>
+      </w:r>
+      <w:r>
+        <w:t xml:space="preserve"> </w:t>
+      </w:r>
+      <w:r>
+        <w:t xml:space="preserve">(</w:t>
+      </w:r>
+      <w:r>
+        <w:rPr>
+          <w:rStyle w:val="VerbatimChar"/>
+        </w:rPr>
+        <w:t xml:space="preserve">int_taxpayer__master</w:t>
+      </w:r>
+      <w:r>
+        <w:t xml:space="preserve">, which joins identity across domains on TIN), the</w:t>
+      </w:r>
+      <w:r>
+        <w:t xml:space="preserve"> </w:t>
+      </w:r>
+      <w:r>
+        <w:rPr>
+          <w:b/>
+        </w:rPr>
+        <w:t xml:space="preserve">shared</w:t>
+      </w:r>
+      <w:r>
+        <w:rPr>
+          <w:b/>
+        </w:rPr>
+        <w:t xml:space="preserve"> </w:t>
+      </w:r>
+      <w:r>
+        <w:rPr>
+          <w:b/>
+        </w:rPr>
+        <w:t xml:space="preserve">metric definitions</w:t>
+      </w:r>
+      <w:r>
+        <w:t xml:space="preserve"> </w:t>
+      </w:r>
+      <w:r>
+        <w:t xml:space="preserve">(e.g. </w:t>
+      </w:r>
+      <w:r>
+        <w:rPr>
+          <w:rStyle w:val="VerbatimChar"/>
+        </w:rPr>
+        <w:t xml:space="preserve">total_outstanding</w:t>
+      </w:r>
+      <w:r>
+        <w:t xml:space="preserve">, ageing bands), the shared</w:t>
+      </w:r>
+      <w:r>
+        <w:t xml:space="preserve"> </w:t>
+      </w:r>
+      <w:r>
+        <w:rPr>
+          <w:b/>
+        </w:rPr>
+        <w:t xml:space="preserve">reference vocabularies</w:t>
+      </w:r>
+      <w:r>
+        <w:t xml:space="preserve">,</w:t>
+      </w:r>
+      <w:r>
+        <w:t xml:space="preserve"> </w:t>
+      </w:r>
+      <w:r>
+        <w:t xml:space="preserve">the</w:t>
+      </w:r>
+      <w:r>
+        <w:t xml:space="preserve"> </w:t>
+      </w:r>
+      <w:r>
+        <w:rPr>
+          <w:b/>
+        </w:rPr>
+        <w:t xml:space="preserve">naming conventions</w:t>
+      </w:r>
+      <w:r>
+        <w:t xml:space="preserve">, and the</w:t>
+      </w:r>
+      <w:r>
+        <w:t xml:space="preserve"> </w:t>
+      </w:r>
+      <w:r>
+        <w:rPr>
+          <w:rStyle w:val="VerbatimChar"/>
+          <w:b/>
+        </w:rPr>
+        <w:t xml:space="preserve">main</w:t>
+      </w:r>
+      <w:r>
+        <w:t xml:space="preserve"> </w:t>
+      </w:r>
+      <w:r>
+        <w:t xml:space="preserve">branch. Appoint</w:t>
+      </w:r>
+      <w:r>
+        <w:t xml:space="preserve"> </w:t>
+      </w:r>
+      <w:r>
+        <w:rPr>
+          <w:b/>
+        </w:rPr>
+        <w:t xml:space="preserve">one rotating</w:t>
+      </w:r>
+      <w:r>
+        <w:rPr>
+          <w:b/>
+        </w:rPr>
+        <w:t xml:space="preserve"> </w:t>
+      </w:r>
+      <w:r>
+        <w:rPr>
+          <w:b/>
+        </w:rPr>
+        <w:t xml:space="preserve">“</w:t>
+      </w:r>
+      <w:r>
+        <w:rPr>
+          <w:b/>
+        </w:rPr>
+        <w:t xml:space="preserve">platform steward</w:t>
+      </w:r>
+      <w:r>
+        <w:rPr>
+          <w:b/>
+        </w:rPr>
+        <w:t xml:space="preserve">”</w:t>
+      </w:r>
+      <w:r>
+        <w:t xml:space="preserve"> </w:t>
+      </w:r>
+      <w:r>
+        <w:t xml:space="preserve">to own</w:t>
+      </w:r>
+      <w:r>
+        <w:t xml:space="preserve"> </w:t>
+      </w:r>
+      <w:r>
+        <w:t xml:space="preserve">these.</w:t>
+      </w:r>
+      <w:r>
+        <w:t xml:space="preserve"> </w:t>
+      </w:r>
+      <w:r>
+        <w:rPr>
+          <w:b/>
+        </w:rPr>
+        <w:t xml:space="preserve">Domain owners compose from them and request changes by PR — they never fork or redefine them</w:t>
+      </w:r>
+      <w:r>
+        <w:t xml:space="preserve"> </w:t>
+      </w:r>
+      <w:r>
+        <w:t xml:space="preserve">(P6: one definition per fact, pull from Gold). A cross-domain mart (e.g. one joining debt + VAT) is built</w:t>
+      </w:r>
+      <w:r>
+        <w:t xml:space="preserve"> </w:t>
+      </w:r>
+      <w:r>
+        <w:t xml:space="preserve">from the domain</w:t>
+      </w:r>
+      <w:r>
+        <w:t xml:space="preserve"> </w:t>
+      </w:r>
+      <w:r>
+        <w:rPr>
+          <w:rStyle w:val="VerbatimChar"/>
+        </w:rPr>
+        <w:t xml:space="preserve">int_</w:t>
+      </w:r>
+      <w:r>
+        <w:t xml:space="preserve"> </w:t>
+      </w:r>
+      <w:r>
+        <w:t xml:space="preserve">models, with the steward reviewing the join. This single rule prevents the classic</w:t>
+      </w:r>
+      <w:r>
+        <w:t xml:space="preserve"> </w:t>
+      </w:r>
+      <w:r>
+        <w:t xml:space="preserve">failure of three domains each inventing their own</w:t>
+      </w:r>
+      <w:r>
+        <w:t xml:space="preserve"> </w:t>
+      </w:r>
+      <w:r>
+        <w:t xml:space="preserve">“</w:t>
+      </w:r>
+      <w:r>
+        <w:t xml:space="preserve">taxpayer</w:t>
+      </w:r>
+      <w:r>
+        <w:t xml:space="preserve">”</w:t>
+      </w:r>
+      <w:r>
+        <w:t xml:space="preserve">.</w:t>
+      </w:r>
+    </w:p>
+    <w:p>
+      <w:pPr>
+        <w:pStyle w:val="BodyText"/>
+      </w:pPr>
+      <w:r>
+        <w:rPr>
+          <w:b/>
+        </w:rPr>
+        <w:t xml:space="preserve">Git is the consistency backbone</w:t>
+      </w:r>
+      <w:r>
+        <w:t xml:space="preserve"> </w:t>
+      </w:r>
+      <w:r>
+        <w:t xml:space="preserve">(this is where parallel work converges):</w:t>
       </w:r>
     </w:p>
     <w:p>
       <w:pPr>
         <w:numPr>
-          <w:ilvl w:val="1"/>
+          <w:ilvl w:val="0"/>
           <w:numId w:val="1027"/>
         </w:numPr>
         <w:pStyle w:val="Compact"/>
       </w:pPr>
       <w:r>
-        <w:rPr>
-          <w:i/>
-        </w:rPr>
-        <w:t xml:space="preserve">By role</w:t>
-      </w:r>
-      <w:r>
-        <w:t xml:space="preserve"> </w:t>
-      </w:r>
-      <w:r>
-        <w:t xml:space="preserve">—</w:t>
-      </w:r>
-      <w:r>
-        <w:t xml:space="preserve"> </w:t>
-      </w:r>
-      <w:r>
-        <w:rPr>
-          <w:b/>
-        </w:rPr>
-        <w:t xml:space="preserve">Dev A</w:t>
-      </w:r>
-      <w:r>
-        <w:t xml:space="preserve"> </w:t>
-      </w:r>
-      <w:r>
-        <w:t xml:space="preserve">ingestion &amp; catalogue (</w:t>
-      </w:r>
-      <w:r>
-        <w:rPr>
-          <w:rStyle w:val="VerbatimChar"/>
-        </w:rPr>
-        <w:t xml:space="preserve">onboard-source</w:t>
-      </w:r>
-      <w:r>
-        <w:t xml:space="preserve">,</w:t>
-      </w:r>
-      <w:r>
-        <w:t xml:space="preserve"> </w:t>
-      </w:r>
-      <w:r>
-        <w:rPr>
-          <w:rStyle w:val="VerbatimChar"/>
-        </w:rPr>
-        <w:t xml:space="preserve">import-schema-to-catalogue</w:t>
-      </w:r>
-      <w:r>
-        <w:t xml:space="preserve">,</w:t>
-      </w:r>
-      <w:r>
-        <w:t xml:space="preserve"> </w:t>
-      </w:r>
-      <w:r>
-        <w:rPr>
-          <w:rStyle w:val="VerbatimChar"/>
-        </w:rPr>
-        <w:t xml:space="preserve">legacy-module-to-openmetadata</w:t>
-      </w:r>
-      <w:r>
-        <w:t xml:space="preserve">,</w:t>
-      </w:r>
-      <w:r>
-        <w:t xml:space="preserve"> </w:t>
-      </w:r>
-      <w:r>
-        <w:rPr>
-          <w:rStyle w:val="VerbatimChar"/>
-        </w:rPr>
-        <w:t xml:space="preserve">verify-catalogue-semantics</w:t>
-      </w:r>
-      <w:r>
-        <w:t xml:space="preserve">);</w:t>
-      </w:r>
-      <w:r>
-        <w:t xml:space="preserve"> </w:t>
-      </w:r>
-      <w:r>
-        <w:rPr>
-          <w:b/>
-        </w:rPr>
-        <w:t xml:space="preserve">Dev B</w:t>
-      </w:r>
-      <w:r>
-        <w:t xml:space="preserve"> </w:t>
-      </w:r>
-      <w:r>
-        <w:t xml:space="preserve">modelling &amp; quality</w:t>
-      </w:r>
-      <w:r>
-        <w:t xml:space="preserve"> </w:t>
-      </w:r>
-      <w:r>
-        <w:t xml:space="preserve">(</w:t>
-      </w:r>
-      <w:r>
-        <w:rPr>
-          <w:rStyle w:val="VerbatimChar"/>
-        </w:rPr>
-        <w:t xml:space="preserve">build-dbt-model</w:t>
-      </w:r>
-      <w:r>
-        <w:t xml:space="preserve">,</w:t>
-      </w:r>
-      <w:r>
-        <w:t xml:space="preserve"> </w:t>
-      </w:r>
-      <w:r>
-        <w:rPr>
-          <w:rStyle w:val="VerbatimChar"/>
-        </w:rPr>
-        <w:t xml:space="preserve">add-dq-checks</w:t>
-      </w:r>
-      <w:r>
-        <w:t xml:space="preserve">);</w:t>
-      </w:r>
-      <w:r>
-        <w:t xml:space="preserve"> </w:t>
-      </w:r>
-      <w:r>
-        <w:rPr>
-          <w:b/>
-        </w:rPr>
-        <w:t xml:space="preserve">Dev C</w:t>
-      </w:r>
-      <w:r>
-        <w:t xml:space="preserve"> </w:t>
-      </w:r>
-      <w:r>
-        <w:t xml:space="preserve">consumption &amp; ops (</w:t>
-      </w:r>
-      <w:r>
-        <w:rPr>
-          <w:rStyle w:val="VerbatimChar"/>
-        </w:rPr>
-        <w:t xml:space="preserve">build-superset-dashboard</w:t>
-      </w:r>
-      <w:r>
-        <w:t xml:space="preserve">,</w:t>
-      </w:r>
-      <w:r>
-        <w:t xml:space="preserve"> </w:t>
-      </w:r>
-      <w:r>
-        <w:rPr>
-          <w:rStyle w:val="VerbatimChar"/>
-        </w:rPr>
-        <w:t xml:space="preserve">expose-api</w:t>
-      </w:r>
-      <w:r>
-        <w:t xml:space="preserve">, CI/monitoring,</w:t>
-      </w:r>
-      <w:r>
-        <w:t xml:space="preserve"> </w:t>
-      </w:r>
-      <w:r>
-        <w:rPr>
-          <w:rStyle w:val="VerbatimChar"/>
-        </w:rPr>
-        <w:t xml:space="preserve">production-readiness-check</w:t>
-      </w:r>
-      <w:r>
-        <w:t xml:space="preserve">).</w:t>
+        <w:t xml:space="preserve">Branch per task (</w:t>
+      </w:r>
+      <w:r>
+        <w:rPr>
+          <w:rStyle w:val="VerbatimChar"/>
+        </w:rPr>
+        <w:t xml:space="preserve">feat/debt-aged-balances</w:t>
+      </w:r>
+      <w:r>
+        <w:t xml:space="preserve">); keep PRs small.</w:t>
       </w:r>
     </w:p>
     <w:p>
       <w:pPr>
         <w:numPr>
-          <w:ilvl w:val="1"/>
+          <w:ilvl w:val="0"/>
           <w:numId w:val="1027"/>
         </w:numPr>
         <w:pStyle w:val="Compact"/>
       </w:pPr>
       <w:r>
         <w:rPr>
-          <w:i/>
-        </w:rPr>
-        <w:t xml:space="preserve">By source/domain</w:t>
-      </w:r>
-      <w:r>
-        <w:t xml:space="preserve"> </w:t>
-      </w:r>
-      <w:r>
-        <w:t xml:space="preserve">(better once you’re doing breadth) — each developer owns a</w:t>
-      </w:r>
-      <w:r>
-        <w:t xml:space="preserve"> </w:t>
-      </w:r>
-      <w:r>
-        <w:rPr>
-          <w:b/>
-        </w:rPr>
-        <w:t xml:space="preserve">source or mart</w:t>
-      </w:r>
-      <w:r>
-        <w:rPr>
-          <w:b/>
-        </w:rPr>
-        <w:t xml:space="preserve"> </w:t>
-      </w:r>
-      <w:r>
-        <w:rPr>
-          <w:b/>
-        </w:rPr>
-        <w:t xml:space="preserve">family end-to-end</w:t>
-      </w:r>
-      <w:r>
-        <w:t xml:space="preserve"> </w:t>
-      </w:r>
-      <w:r>
-        <w:t xml:space="preserve">through the whole loop. Fewer hand-offs; each person carries their slice from</w:t>
-      </w:r>
-      <w:r>
-        <w:t xml:space="preserve"> </w:t>
-      </w:r>
-      <w:r>
-        <w:t xml:space="preserve">Bronze to a green gate.</w:t>
+          <w:b/>
+        </w:rPr>
+        <w:t xml:space="preserve">Every PR is reviewed by another developer before merge</w:t>
+      </w:r>
+      <w:r>
+        <w:t xml:space="preserve"> </w:t>
+      </w:r>
+      <w:r>
+        <w:t xml:space="preserve">— peer review is where consistency is</w:t>
+      </w:r>
+      <w:r>
+        <w:t xml:space="preserve"> </w:t>
+      </w:r>
+      <w:r>
+        <w:t xml:space="preserve">actually enforced.</w:t>
+      </w:r>
+    </w:p>
+    <w:p>
+      <w:pPr>
+        <w:numPr>
+          <w:ilvl w:val="0"/>
+          <w:numId w:val="1027"/>
+        </w:numPr>
+        <w:pStyle w:val="Compact"/>
+      </w:pPr>
+      <w:r>
+        <w:rPr>
+          <w:rStyle w:val="VerbatimChar"/>
+        </w:rPr>
+        <w:t xml:space="preserve">main</w:t>
+      </w:r>
+      <w:r>
+        <w:t xml:space="preserve"> </w:t>
+      </w:r>
+      <w:r>
+        <w:t xml:space="preserve">is</w:t>
+      </w:r>
+      <w:r>
+        <w:t xml:space="preserve"> </w:t>
+      </w:r>
+      <w:r>
+        <w:rPr>
+          <w:b/>
+        </w:rPr>
+        <w:t xml:space="preserve">protected</w:t>
+      </w:r>
+      <w:r>
+        <w:t xml:space="preserve">, and</w:t>
+      </w:r>
+      <w:r>
+        <w:t xml:space="preserve"> </w:t>
+      </w:r>
+      <w:r>
+        <w:rPr>
+          <w:b/>
+        </w:rPr>
+        <w:t xml:space="preserve">CI runs</w:t>
+      </w:r>
+      <w:r>
+        <w:rPr>
+          <w:b/>
+        </w:rPr>
+        <w:t xml:space="preserve"> </w:t>
+      </w:r>
+      <w:r>
+        <w:rPr>
+          <w:rStyle w:val="VerbatimChar"/>
+          <w:b/>
+        </w:rPr>
+        <w:t xml:space="preserve">dbt test</w:t>
+      </w:r>
+      <w:r>
+        <w:rPr>
+          <w:b/>
+        </w:rPr>
+        <w:t xml:space="preserve"> </w:t>
+      </w:r>
+      <w:r>
+        <w:rPr>
+          <w:b/>
+        </w:rPr>
+        <w:t xml:space="preserve">+ the pre-commit hooks on every PR</w:t>
+      </w:r>
+      <w:r>
+        <w:t xml:space="preserve"> </w:t>
+      </w:r>
+      <w:r>
+        <w:t xml:space="preserve">— a red test</w:t>
+      </w:r>
+      <w:r>
+        <w:t xml:space="preserve"> </w:t>
+      </w:r>
+      <w:r>
+        <w:t xml:space="preserve">blocks the merge.</w:t>
+      </w:r>
+    </w:p>
+    <w:p>
+      <w:pPr>
+        <w:numPr>
+          <w:ilvl w:val="0"/>
+          <w:numId w:val="1027"/>
+        </w:numPr>
+        <w:pStyle w:val="Compact"/>
+      </w:pPr>
+      <w:r>
+        <w:rPr>
+          <w:b/>
+        </w:rPr>
+        <w:t xml:space="preserve">One artefact, one owner at a time</w:t>
+      </w:r>
+      <w:r>
+        <w:t xml:space="preserve"> </w:t>
+      </w:r>
+      <w:r>
+        <w:t xml:space="preserve">— don’t let two people edit the same model/spec; the board</w:t>
+      </w:r>
+      <w:r>
+        <w:t xml:space="preserve"> </w:t>
+      </w:r>
+      <w:r>
+        <w:t xml:space="preserve">shows who owns what.</w:t>
       </w:r>
     </w:p>
     <w:p>
@@ -6671,79 +6926,79 @@
         <w:rPr>
           <w:b/>
         </w:rPr>
-        <w:t xml:space="preserve">Appoint one owner for the shared core.</w:t>
-      </w:r>
-      <w:r>
-        <w:t xml:space="preserve"> </w:t>
-      </w:r>
-      <w:r>
-        <w:t xml:space="preserve">The biggest consistency risk is two people defining the same</w:t>
-      </w:r>
-      <w:r>
-        <w:t xml:space="preserve"> </w:t>
-      </w:r>
-      <w:r>
-        <w:t xml:space="preserve">thing differently. Give</w:t>
-      </w:r>
-      <w:r>
-        <w:t xml:space="preserve"> </w:t>
-      </w:r>
-      <w:r>
-        <w:rPr>
-          <w:b/>
-        </w:rPr>
-        <w:t xml:space="preserve">one developer (rotating) ownership of the single-source-of-truth pieces</w:t>
-      </w:r>
-      <w:r>
-        <w:t xml:space="preserve"> </w:t>
-      </w:r>
-      <w:r>
-        <w:t xml:space="preserve">—</w:t>
-      </w:r>
-      <w:r>
-        <w:t xml:space="preserve"> </w:t>
-      </w:r>
-      <w:r>
-        <w:rPr>
-          <w:rStyle w:val="VerbatimChar"/>
-        </w:rPr>
-        <w:t xml:space="preserve">int_taxpayer__master</w:t>
-      </w:r>
-      <w:r>
-        <w:t xml:space="preserve"> </w:t>
-      </w:r>
-      <w:r>
-        <w:t xml:space="preserve">(Taxpayer-360), the shared metric definitions, the naming conventions, and the</w:t>
-      </w:r>
-      <w:r>
-        <w:t xml:space="preserve"> </w:t>
-      </w:r>
-      <w:r>
-        <w:rPr>
-          <w:rStyle w:val="VerbatimChar"/>
-        </w:rPr>
-        <w:t xml:space="preserve">main</w:t>
-      </w:r>
-      <w:r>
-        <w:t xml:space="preserve"> </w:t>
-      </w:r>
-      <w:r>
-        <w:t xml:space="preserve">branch. Nobody else changes those without that owner’s review. Everyone else</w:t>
-      </w:r>
-      <w:r>
-        <w:t xml:space="preserve"> </w:t>
-      </w:r>
-      <w:r>
-        <w:rPr>
-          <w:b/>
-        </w:rPr>
-        <w:t xml:space="preserve">composes from</w:t>
-      </w:r>
-      <w:r>
-        <w:t xml:space="preserve"> </w:t>
-      </w:r>
-      <w:r>
-        <w:t xml:space="preserve">them (P6: pull from Gold, one definition per fact).</w:t>
+        <w:t xml:space="preserve">Cadence:</w:t>
+      </w:r>
+      <w:r>
+        <w:t xml:space="preserve"> </w:t>
+      </w:r>
+      <w:r>
+        <w:t xml:space="preserve">a 15-minute daily standup (who’s on what, blockers, who needs whose output); a shared</w:t>
+      </w:r>
+      <w:r>
+        <w:t xml:space="preserve"> </w:t>
+      </w:r>
+      <w:r>
+        <w:t xml:space="preserve">backlog/board with clear owners (the coverage and</w:t>
+      </w:r>
+      <w:r>
+        <w:t xml:space="preserve"> </w:t>
+      </w:r>
+      <w:r>
+        <w:rPr>
+          <w:rStyle w:val="VerbatimChar"/>
+        </w:rPr>
+        <w:t xml:space="preserve">onboard-consumer</w:t>
+      </w:r>
+      <w:r>
+        <w:t xml:space="preserve"> </w:t>
+      </w:r>
+      <w:r>
+        <w:t xml:space="preserve">backlogs feed it); a weekly</w:t>
+      </w:r>
+      <w:r>
+        <w:t xml:space="preserve"> </w:t>
+      </w:r>
+      <w:r>
+        <w:t xml:space="preserve">integration + a short design huddle for any cross-cutting decision (</w:t>
+      </w:r>
+      <w:r>
+        <w:rPr>
+          <w:b/>
+        </w:rPr>
+        <w:t xml:space="preserve">record it as an ADR</w:t>
+      </w:r>
+      <w:r>
+        <w:t xml:space="preserve"> </w:t>
+      </w:r>
+      <w:r>
+        <w:t xml:space="preserve">via</w:t>
+      </w:r>
+      <w:r>
+        <w:t xml:space="preserve"> </w:t>
+      </w:r>
+      <w:r>
+        <w:rPr>
+          <w:rStyle w:val="VerbatimChar"/>
+        </w:rPr>
+        <w:t xml:space="preserve">mtca-architecture-principles</w:t>
+      </w:r>
+      <w:r>
+        <w:t xml:space="preserve">).</w:t>
+      </w:r>
+      <w:r>
+        <w:t xml:space="preserve"> </w:t>
+      </w:r>
+      <w:r>
+        <w:rPr>
+          <w:b/>
+        </w:rPr>
+        <w:t xml:space="preserve">Definition of Done = the gates are green</w:t>
+      </w:r>
+      <w:r>
+        <w:t xml:space="preserve"> </w:t>
+      </w:r>
+      <w:r>
+        <w:t xml:space="preserve">(DQ, verify, readiness).</w:t>
       </w:r>
     </w:p>
     <w:p>
@@ -6751,17 +7006,90 @@
         <w:pStyle w:val="BodyText"/>
       </w:pPr>
       <w:r>
-        <w:rPr>
-          <w:b/>
-        </w:rPr>
-        <w:t xml:space="preserve">Git is the consistency backbone</w:t>
-      </w:r>
-      <w:r>
-        <w:t xml:space="preserve"> </w:t>
-      </w:r>
-      <w:r>
-        <w:t xml:space="preserve">(this is where parallel work converges):</w:t>
-      </w:r>
+        <w:t xml:space="preserve">The four rules that keep three people aligned:</w:t>
+      </w:r>
+      <w:r>
+        <w:t xml:space="preserve"> </w:t>
+      </w:r>
+      <w:r>
+        <w:rPr>
+          <w:b/>
+        </w:rPr>
+        <w:t xml:space="preserve">decide by citation</w:t>
+      </w:r>
+      <w:r>
+        <w:t xml:space="preserve"> </w:t>
+      </w:r>
+      <w:r>
+        <w:t xml:space="preserve">(principles/ADRs),</w:t>
+      </w:r>
+      <w:r>
+        <w:t xml:space="preserve"> </w:t>
+      </w:r>
+      <w:r>
+        <w:rPr>
+          <w:b/>
+        </w:rPr>
+        <w:t xml:space="preserve">generate —</w:t>
+      </w:r>
+      <w:r>
+        <w:rPr>
+          <w:b/>
+        </w:rPr>
+        <w:t xml:space="preserve"> </w:t>
+      </w:r>
+      <w:r>
+        <w:rPr>
+          <w:b/>
+        </w:rPr>
+        <w:t xml:space="preserve">never hand-edit</w:t>
+      </w:r>
+      <w:r>
+        <w:t xml:space="preserve">,</w:t>
+      </w:r>
+      <w:r>
+        <w:t xml:space="preserve"> </w:t>
+      </w:r>
+      <w:r>
+        <w:rPr>
+          <w:b/>
+        </w:rPr>
+        <w:t xml:space="preserve">one definition per fact</w:t>
+      </w:r>
+      <w:r>
+        <w:t xml:space="preserve"> </w:t>
+      </w:r>
+      <w:r>
+        <w:t xml:space="preserve">(pull from Gold), and</w:t>
+      </w:r>
+      <w:r>
+        <w:t xml:space="preserve"> </w:t>
+      </w:r>
+      <w:r>
+        <w:rPr>
+          <w:b/>
+        </w:rPr>
+        <w:t xml:space="preserve">peer-reviewed PRs through CI</w:t>
+      </w:r>
+      <w:r>
+        <w:t xml:space="preserve">.</w:t>
+      </w:r>
+      <w:r>
+        <w:t xml:space="preserve"> </w:t>
+      </w:r>
+      <w:r>
+        <w:t xml:space="preserve">Rotate the roles so all three can do every part by the end.</w:t>
+      </w:r>
+    </w:p>
+    <w:p>
+      <w:pPr>
+        <w:pStyle w:val="Heading3"/>
+      </w:pPr>
+      <w:bookmarkStart w:id="40" w:name="daily-rhythm"/>
+      <w:r>
+        <w:t xml:space="preserve">Daily rhythm</w:t>
+      </w:r>
+      <w:bookmarkEnd w:id="40"/>
     </w:p>
     <w:p>
       <w:pPr>
@@ -6772,16 +7100,16 @@
         <w:pStyle w:val="Compact"/>
       </w:pPr>
       <w:r>
-        <w:t xml:space="preserve">Branch per task (</w:t>
-      </w:r>
-      <w:r>
-        <w:rPr>
-          <w:rStyle w:val="VerbatimChar"/>
-        </w:rPr>
-        <w:t xml:space="preserve">feat/debt-aged-balances</w:t>
-      </w:r>
-      <w:r>
-        <w:t xml:space="preserve">); keep PRs small.</w:t>
+        <w:rPr>
+          <w:b/>
+        </w:rPr>
+        <w:t xml:space="preserve">Pick the next slice</w:t>
+      </w:r>
+      <w:r>
+        <w:t xml:space="preserve"> </w:t>
+      </w:r>
+      <w:r>
+        <w:t xml:space="preserve">(a source, a mart, a dashboard) from the backlog.</w:t>
       </w:r>
     </w:p>
     <w:p>
@@ -6796,19 +7124,31 @@
         <w:rPr>
           <w:b/>
         </w:rPr>
-        <w:t xml:space="preserve">Every PR is reviewed by another developer before merge</w:t>
-      </w:r>
-      <w:r>
-        <w:t xml:space="preserve"> </w:t>
-      </w:r>
-      <w:r>
-        <w:t xml:space="preserve">— peer review is where consistency is</w:t>
-      </w:r>
-      <w:r>
-        <w:t xml:space="preserve"> </w:t>
-      </w:r>
-      <w:r>
-        <w:t xml:space="preserve">actually enforced.</w:t>
+        <w:t xml:space="preserve">Decide the track</w:t>
+      </w:r>
+      <w:r>
+        <w:t xml:space="preserve">: generate in Cowork (Track A); run dbt/loads/imports and commit on your</w:t>
+      </w:r>
+      <w:r>
+        <w:t xml:space="preserve"> </w:t>
+      </w:r>
+      <w:r>
+        <w:t xml:space="preserve">workstation (Track B). Ask</w:t>
+      </w:r>
+      <w:r>
+        <w:t xml:space="preserve"> </w:t>
+      </w:r>
+      <w:r>
+        <w:rPr>
+          <w:rStyle w:val="VerbatimChar"/>
+        </w:rPr>
+        <w:t xml:space="preserve">mtca-dev-workflow</w:t>
+      </w:r>
+      <w:r>
+        <w:t xml:space="preserve"> </w:t>
+      </w:r>
+      <w:r>
+        <w:t xml:space="preserve">if unsure.</w:t>
       </w:r>
     </w:p>
     <w:p>
@@ -6821,73 +7161,36 @@
       </w:pPr>
       <w:r>
         <w:rPr>
-          <w:rStyle w:val="VerbatimChar"/>
-        </w:rPr>
-        <w:t xml:space="preserve">main</w:t>
-      </w:r>
-      <w:r>
-        <w:t xml:space="preserve"> </w:t>
-      </w:r>
-      <w:r>
-        <w:t xml:space="preserve">is</w:t>
-      </w:r>
-      <w:r>
-        <w:t xml:space="preserve"> </w:t>
-      </w:r>
-      <w:r>
-        <w:rPr>
-          <w:b/>
-        </w:rPr>
-        <w:t xml:space="preserve">protected</w:t>
-      </w:r>
-      <w:r>
-        <w:t xml:space="preserve">, and</w:t>
-      </w:r>
-      <w:r>
-        <w:t xml:space="preserve"> </w:t>
-      </w:r>
-      <w:r>
-        <w:rPr>
-          <w:b/>
-        </w:rPr>
-        <w:t xml:space="preserve">CI runs</w:t>
-      </w:r>
-      <w:r>
-        <w:rPr>
-          <w:b/>
-        </w:rPr>
-        <w:t xml:space="preserve"> </w:t>
-      </w:r>
-      <w:r>
-        <w:rPr>
-          <w:rStyle w:val="VerbatimChar"/>
-          <w:b/>
-        </w:rPr>
-        <w:t xml:space="preserve">dbt test</w:t>
-      </w:r>
-      <w:r>
-        <w:rPr>
-          <w:b/>
-        </w:rPr>
-        <w:t xml:space="preserve"> </w:t>
-      </w:r>
-      <w:r>
-        <w:rPr>
-          <w:b/>
-        </w:rPr>
-        <w:t xml:space="preserve">+ the pre-commit hooks on every PR</w:t>
-      </w:r>
-      <w:r>
-        <w:t xml:space="preserve"> </w:t>
-      </w:r>
-      <w:r>
-        <w:t xml:space="preserve">— a red test</w:t>
-      </w:r>
-      <w:r>
-        <w:t xml:space="preserve"> </w:t>
-      </w:r>
-      <w:r>
-        <w:t xml:space="preserve">blocks the merge.</w:t>
+          <w:b/>
+        </w:rPr>
+        <w:t xml:space="preserve">Use the skill, don’t free-hand</w:t>
+      </w:r>
+      <w:r>
+        <w:t xml:space="preserve">: say what you want; review the generated spec/output; fill any</w:t>
+      </w:r>
+      <w:r>
+        <w:t xml:space="preserve"> </w:t>
+      </w:r>
+      <w:r>
+        <w:rPr>
+          <w:rStyle w:val="VerbatimChar"/>
+        </w:rPr>
+        <w:t xml:space="preserve">TODO</w:t>
+      </w:r>
+      <w:r>
+        <w:t xml:space="preserve">/DRAFT; run it live;</w:t>
+      </w:r>
+      <w:r>
+        <w:t xml:space="preserve"> </w:t>
+      </w:r>
+      <w:r>
+        <w:rPr>
+          <w:b/>
+        </w:rPr>
+        <w:t xml:space="preserve">commit</w:t>
+      </w:r>
+      <w:r>
+        <w:t xml:space="preserve">.</w:t>
       </w:r>
     </w:p>
     <w:p>
@@ -6902,193 +7205,52 @@
         <w:rPr>
           <w:b/>
         </w:rPr>
-        <w:t xml:space="preserve">One artefact, one owner at a time</w:t>
-      </w:r>
-      <w:r>
-        <w:t xml:space="preserve"> </w:t>
-      </w:r>
-      <w:r>
-        <w:t xml:space="preserve">— don’t let two people edit the same model/spec; the board</w:t>
-      </w:r>
-      <w:r>
-        <w:t xml:space="preserve"> </w:t>
-      </w:r>
-      <w:r>
-        <w:t xml:space="preserve">shows who owns what.</w:t>
-      </w:r>
-    </w:p>
-    <w:p>
-      <w:pPr>
-        <w:pStyle w:val="FirstParagraph"/>
-      </w:pPr>
-      <w:r>
-        <w:rPr>
-          <w:b/>
-        </w:rPr>
-        <w:t xml:space="preserve">Cadence:</w:t>
-      </w:r>
-      <w:r>
-        <w:t xml:space="preserve"> </w:t>
-      </w:r>
-      <w:r>
-        <w:t xml:space="preserve">a 15-minute daily standup (who’s on what, blockers, who needs whose output); a shared</w:t>
-      </w:r>
-      <w:r>
-        <w:t xml:space="preserve"> </w:t>
-      </w:r>
-      <w:r>
-        <w:t xml:space="preserve">backlog/board with clear owners (the coverage and</w:t>
-      </w:r>
-      <w:r>
-        <w:t xml:space="preserve"> </w:t>
-      </w:r>
-      <w:r>
-        <w:rPr>
-          <w:rStyle w:val="VerbatimChar"/>
-        </w:rPr>
-        <w:t xml:space="preserve">onboard-consumer</w:t>
-      </w:r>
-      <w:r>
-        <w:t xml:space="preserve"> </w:t>
-      </w:r>
-      <w:r>
-        <w:t xml:space="preserve">backlogs feed it); a weekly</w:t>
-      </w:r>
-      <w:r>
-        <w:t xml:space="preserve"> </w:t>
-      </w:r>
-      <w:r>
-        <w:t xml:space="preserve">integration + a short design huddle for any cross-cutting decision (</w:t>
-      </w:r>
-      <w:r>
-        <w:rPr>
-          <w:b/>
-        </w:rPr>
-        <w:t xml:space="preserve">record it as an ADR</w:t>
-      </w:r>
-      <w:r>
-        <w:t xml:space="preserve"> </w:t>
-      </w:r>
-      <w:r>
-        <w:t xml:space="preserve">via</w:t>
-      </w:r>
-      <w:r>
-        <w:t xml:space="preserve"> </w:t>
-      </w:r>
-      <w:r>
-        <w:rPr>
-          <w:rStyle w:val="VerbatimChar"/>
-        </w:rPr>
-        <w:t xml:space="preserve">mtca-architecture-principles</w:t>
-      </w:r>
-      <w:r>
-        <w:t xml:space="preserve">).</w:t>
-      </w:r>
-      <w:r>
-        <w:t xml:space="preserve"> </w:t>
-      </w:r>
-      <w:r>
-        <w:rPr>
-          <w:b/>
-        </w:rPr>
-        <w:t xml:space="preserve">Definition of Done = the gates are green</w:t>
-      </w:r>
-      <w:r>
-        <w:t xml:space="preserve"> </w:t>
-      </w:r>
-      <w:r>
-        <w:t xml:space="preserve">(DQ, verify, readiness).</w:t>
-      </w:r>
-    </w:p>
-    <w:p>
-      <w:pPr>
-        <w:pStyle w:val="BodyText"/>
-      </w:pPr>
-      <w:r>
-        <w:t xml:space="preserve">The four rules that keep three people aligned:</w:t>
-      </w:r>
-      <w:r>
-        <w:t xml:space="preserve"> </w:t>
-      </w:r>
-      <w:r>
-        <w:rPr>
-          <w:b/>
-        </w:rPr>
-        <w:t xml:space="preserve">decide by citation</w:t>
-      </w:r>
-      <w:r>
-        <w:t xml:space="preserve"> </w:t>
-      </w:r>
-      <w:r>
-        <w:t xml:space="preserve">(principles/ADRs),</w:t>
-      </w:r>
-      <w:r>
-        <w:t xml:space="preserve"> </w:t>
-      </w:r>
-      <w:r>
-        <w:rPr>
-          <w:b/>
-        </w:rPr>
-        <w:t xml:space="preserve">generate —</w:t>
-      </w:r>
-      <w:r>
-        <w:rPr>
-          <w:b/>
-        </w:rPr>
-        <w:t xml:space="preserve"> </w:t>
-      </w:r>
-      <w:r>
-        <w:rPr>
-          <w:b/>
-        </w:rPr>
-        <w:t xml:space="preserve">never hand-edit</w:t>
-      </w:r>
-      <w:r>
-        <w:t xml:space="preserve">,</w:t>
-      </w:r>
-      <w:r>
-        <w:t xml:space="preserve"> </w:t>
-      </w:r>
-      <w:r>
-        <w:rPr>
-          <w:b/>
-        </w:rPr>
-        <w:t xml:space="preserve">one definition per fact</w:t>
-      </w:r>
-      <w:r>
-        <w:t xml:space="preserve"> </w:t>
-      </w:r>
-      <w:r>
-        <w:t xml:space="preserve">(pull from Gold), and</w:t>
-      </w:r>
-      <w:r>
-        <w:t xml:space="preserve"> </w:t>
-      </w:r>
-      <w:r>
-        <w:rPr>
-          <w:b/>
-        </w:rPr>
-        <w:t xml:space="preserve">peer-reviewed PRs through CI</w:t>
-      </w:r>
-      <w:r>
-        <w:t xml:space="preserve">.</w:t>
-      </w:r>
-      <w:r>
-        <w:t xml:space="preserve"> </w:t>
-      </w:r>
-      <w:r>
-        <w:t xml:space="preserve">Rotate the roles so all three can do every part by the end.</w:t>
-      </w:r>
-    </w:p>
-    <w:p>
-      <w:pPr>
-        <w:pStyle w:val="Heading3"/>
-      </w:pPr>
-      <w:bookmarkStart w:id="40" w:name="daily-rhythm"/>
-      <w:r>
-        <w:t xml:space="preserve">Daily rhythm</w:t>
-      </w:r>
-      <w:bookmarkEnd w:id="40"/>
+        <w:t xml:space="preserve">Pair</w:t>
+      </w:r>
+      <w:r>
+        <w:t xml:space="preserve">: shadow → pair → lead. The first time on each skill, pair with the STX/contractor; then the</w:t>
+      </w:r>
+      <w:r>
+        <w:t xml:space="preserve"> </w:t>
+      </w:r>
+      <w:r>
+        <w:t xml:space="preserve">team leads. The skill is the script for this.</w:t>
+      </w:r>
+    </w:p>
+    <w:p>
+      <w:pPr>
+        <w:numPr>
+          <w:ilvl w:val="0"/>
+          <w:numId w:val="1028"/>
+        </w:numPr>
+        <w:pStyle w:val="Compact"/>
+      </w:pPr>
+      <w:r>
+        <w:rPr>
+          <w:b/>
+        </w:rPr>
+        <w:t xml:space="preserve">Close the loop</w:t>
+      </w:r>
+      <w:r>
+        <w:t xml:space="preserve">: run the relevant gate (DQ, verify, readiness) before calling it done.</w:t>
+      </w:r>
+    </w:p>
+    <w:p>
+      <w:r>
+        <w:pict>
+          <v:rect style="width:0;height:1.5pt" o:hralign="center" o:hrstd="t" o:hr="t"/>
+        </w:pict>
+      </w:r>
+    </w:p>
+    <w:p>
+      <w:pPr>
+        <w:pStyle w:val="Heading2"/>
+      </w:pPr>
+      <w:bookmarkStart w:id="41" w:name="troubleshooting-faq"/>
+      <w:r>
+        <w:t xml:space="preserve">10. Troubleshooting &amp; FAQ</w:t>
+      </w:r>
+      <w:bookmarkEnd w:id="41"/>
     </w:p>
     <w:p>
       <w:pPr>
@@ -7102,13 +7264,64 @@
         <w:rPr>
           <w:b/>
         </w:rPr>
-        <w:t xml:space="preserve">Pick the next slice</w:t>
-      </w:r>
-      <w:r>
-        <w:t xml:space="preserve"> </w:t>
-      </w:r>
-      <w:r>
-        <w:t xml:space="preserve">(a source, a mart, a dashboard) from the backlog.</w:t>
+        <w:t xml:space="preserve">“</w:t>
+      </w:r>
+      <w:r>
+        <w:rPr>
+          <w:b/>
+        </w:rPr>
+        <w:t xml:space="preserve">dbt didn’t run in Cowork.</w:t>
+      </w:r>
+      <w:r>
+        <w:rPr>
+          <w:b/>
+        </w:rPr>
+        <w:t xml:space="preserve">”</w:t>
+      </w:r>
+      <w:r>
+        <w:t xml:space="preserve"> </w:t>
+      </w:r>
+      <w:r>
+        <w:t xml:space="preserve">Correct — that’s Track B. Cowork</w:t>
+      </w:r>
+      <w:r>
+        <w:t xml:space="preserve"> </w:t>
+      </w:r>
+      <w:r>
+        <w:rPr>
+          <w:i/>
+        </w:rPr>
+        <w:t xml:space="preserve">generates</w:t>
+      </w:r>
+      <w:r>
+        <w:t xml:space="preserve"> </w:t>
+      </w:r>
+      <w:r>
+        <w:t xml:space="preserve">the models; you run</w:t>
+      </w:r>
+      <w:r>
+        <w:t xml:space="preserve"> </w:t>
+      </w:r>
+      <w:r>
+        <w:rPr>
+          <w:rStyle w:val="VerbatimChar"/>
+        </w:rPr>
+        <w:t xml:space="preserve">dbt build</w:t>
+      </w:r>
+      <w:r>
+        <w:t xml:space="preserve"> </w:t>
+      </w:r>
+      <w:r>
+        <w:t xml:space="preserve">on your workstation/stack. (</w:t>
+      </w:r>
+      <w:r>
+        <w:rPr>
+          <w:rStyle w:val="VerbatimChar"/>
+        </w:rPr>
+        <w:t xml:space="preserve">mtca-dev-workflow</w:t>
+      </w:r>
+      <w:r>
+        <w:t xml:space="preserve">.)</w:t>
       </w:r>
     </w:p>
     <w:p>
@@ -7123,31 +7336,95 @@
         <w:rPr>
           <w:b/>
         </w:rPr>
-        <w:t xml:space="preserve">Decide the track</w:t>
-      </w:r>
-      <w:r>
-        <w:t xml:space="preserve">: generate in Cowork (Track A); run dbt/loads/imports and commit on your</w:t>
-      </w:r>
-      <w:r>
-        <w:t xml:space="preserve"> </w:t>
-      </w:r>
-      <w:r>
-        <w:t xml:space="preserve">workstation (Track B). Ask</w:t>
-      </w:r>
-      <w:r>
-        <w:t xml:space="preserve"> </w:t>
-      </w:r>
-      <w:r>
-        <w:rPr>
-          <w:rStyle w:val="VerbatimChar"/>
-        </w:rPr>
-        <w:t xml:space="preserve">mtca-dev-workflow</w:t>
-      </w:r>
-      <w:r>
-        <w:t xml:space="preserve"> </w:t>
-      </w:r>
-      <w:r>
-        <w:t xml:space="preserve">if unsure.</w:t>
+        <w:t xml:space="preserve">“</w:t>
+      </w:r>
+      <w:r>
+        <w:rPr>
+          <w:b/>
+        </w:rPr>
+        <w:t xml:space="preserve">git says</w:t>
+      </w:r>
+      <w:r>
+        <w:rPr>
+          <w:b/>
+        </w:rPr>
+        <w:t xml:space="preserve"> </w:t>
+      </w:r>
+      <w:r>
+        <w:rPr>
+          <w:rStyle w:val="VerbatimChar"/>
+          <w:b/>
+        </w:rPr>
+        <w:t xml:space="preserve">index.lock</w:t>
+      </w:r>
+      <w:r>
+        <w:rPr>
+          <w:b/>
+        </w:rPr>
+        <w:t xml:space="preserve"> </w:t>
+      </w:r>
+      <w:r>
+        <w:rPr>
+          <w:b/>
+        </w:rPr>
+        <w:t xml:space="preserve">exists / can’t commit.</w:t>
+      </w:r>
+      <w:r>
+        <w:rPr>
+          <w:b/>
+        </w:rPr>
+        <w:t xml:space="preserve">”</w:t>
+      </w:r>
+      <w:r>
+        <w:t xml:space="preserve"> </w:t>
+      </w:r>
+      <w:r>
+        <w:t xml:space="preserve">A git command was run inside the Cowork sandbox,</w:t>
+      </w:r>
+      <w:r>
+        <w:t xml:space="preserve"> </w:t>
+      </w:r>
+      <w:r>
+        <w:t xml:space="preserve">which can’t clean up its lock files. Run git</w:t>
+      </w:r>
+      <w:r>
+        <w:t xml:space="preserve"> </w:t>
+      </w:r>
+      <w:r>
+        <w:rPr>
+          <w:b/>
+        </w:rPr>
+        <w:t xml:space="preserve">on your workstation</w:t>
+      </w:r>
+      <w:r>
+        <w:t xml:space="preserve">; if locks are stranded, delete</w:t>
+      </w:r>
+      <w:r>
+        <w:t xml:space="preserve"> </w:t>
+      </w:r>
+      <w:r>
+        <w:rPr>
+          <w:rStyle w:val="VerbatimChar"/>
+        </w:rPr>
+        <w:t xml:space="preserve">.git/index.lock</w:t>
+      </w:r>
+      <w:r>
+        <w:t xml:space="preserve"> </w:t>
+      </w:r>
+      <w:r>
+        <w:t xml:space="preserve">(see</w:t>
+      </w:r>
+      <w:r>
+        <w:t xml:space="preserve"> </w:t>
+      </w:r>
+      <w:r>
+        <w:rPr>
+          <w:rStyle w:val="VerbatimChar"/>
+        </w:rPr>
+        <w:t xml:space="preserve">repo-scaffold/references/git-on-the-workstation.md</w:t>
+      </w:r>
+      <w:r>
+        <w:t xml:space="preserve">).</w:t>
       </w:r>
     </w:p>
     <w:p>
@@ -7162,34 +7439,64 @@
         <w:rPr>
           <w:b/>
         </w:rPr>
-        <w:t xml:space="preserve">Use the skill, don’t free-hand</w:t>
-      </w:r>
-      <w:r>
-        <w:t xml:space="preserve">: say what you want; review the generated spec/output; fill any</w:t>
-      </w:r>
-      <w:r>
-        <w:t xml:space="preserve"> </w:t>
-      </w:r>
-      <w:r>
-        <w:rPr>
-          <w:rStyle w:val="VerbatimChar"/>
-        </w:rPr>
-        <w:t xml:space="preserve">TODO</w:t>
-      </w:r>
-      <w:r>
-        <w:t xml:space="preserve">/DRAFT; run it live;</w:t>
-      </w:r>
-      <w:r>
-        <w:t xml:space="preserve"> </w:t>
-      </w:r>
-      <w:r>
-        <w:rPr>
-          <w:b/>
-        </w:rPr>
-        <w:t xml:space="preserve">commit</w:t>
-      </w:r>
-      <w:r>
-        <w:t xml:space="preserve">.</w:t>
+        <w:t xml:space="preserve">“</w:t>
+      </w:r>
+      <w:r>
+        <w:rPr>
+          <w:b/>
+        </w:rPr>
+        <w:t xml:space="preserve">The script left files inside the skill folder.</w:t>
+      </w:r>
+      <w:r>
+        <w:rPr>
+          <w:b/>
+        </w:rPr>
+        <w:t xml:space="preserve">”</w:t>
+      </w:r>
+      <w:r>
+        <w:t xml:space="preserve"> </w:t>
+      </w:r>
+      <w:r>
+        <w:t xml:space="preserve">Point</w:t>
+      </w:r>
+      <w:r>
+        <w:t xml:space="preserve"> </w:t>
+      </w:r>
+      <w:r>
+        <w:rPr>
+          <w:rStyle w:val="VerbatimChar"/>
+        </w:rPr>
+        <w:t xml:space="preserve">--out</w:t>
+      </w:r>
+      <w:r>
+        <w:t xml:space="preserve">/</w:t>
+      </w:r>
+      <w:r>
+        <w:rPr>
+          <w:rStyle w:val="VerbatimChar"/>
+        </w:rPr>
+        <w:t xml:space="preserve">--repo</w:t>
+      </w:r>
+      <w:r>
+        <w:t xml:space="preserve"> </w:t>
+      </w:r>
+      <w:r>
+        <w:t xml:space="preserve">at your repo’s workspace</w:t>
+      </w:r>
+      <w:r>
+        <w:t xml:space="preserve"> </w:t>
+      </w:r>
+      <w:r>
+        <w:t xml:space="preserve">(e.g. </w:t>
+      </w:r>
+      <w:r>
+        <w:rPr>
+          <w:rStyle w:val="VerbatimChar"/>
+        </w:rPr>
+        <w:t xml:space="preserve">catalogue/module-semantics/</w:t>
+      </w:r>
+      <w:r>
+        <w:t xml:space="preserve">), not the skill directory.</w:t>
       </w:r>
     </w:p>
     <w:p>
@@ -7204,16 +7511,76 @@
         <w:rPr>
           <w:b/>
         </w:rPr>
-        <w:t xml:space="preserve">Pair</w:t>
-      </w:r>
-      <w:r>
-        <w:t xml:space="preserve">: shadow → pair → lead. The first time on each skill, pair with the STX/contractor; then the</w:t>
-      </w:r>
-      <w:r>
-        <w:t xml:space="preserve"> </w:t>
-      </w:r>
-      <w:r>
-        <w:t xml:space="preserve">team leads. The skill is the script for this.</w:t>
+        <w:t xml:space="preserve">“</w:t>
+      </w:r>
+      <w:r>
+        <w:rPr>
+          <w:b/>
+        </w:rPr>
+        <w:t xml:space="preserve">A YAML-spec skill says</w:t>
+      </w:r>
+      <w:r>
+        <w:rPr>
+          <w:b/>
+        </w:rPr>
+        <w:t xml:space="preserve"> </w:t>
+      </w:r>
+      <w:r>
+        <w:rPr>
+          <w:b/>
+        </w:rPr>
+        <w:t xml:space="preserve">‘</w:t>
+      </w:r>
+      <w:r>
+        <w:rPr>
+          <w:b/>
+        </w:rPr>
+        <w:t xml:space="preserve">install pyyaml</w:t>
+      </w:r>
+      <w:r>
+        <w:rPr>
+          <w:b/>
+        </w:rPr>
+        <w:t xml:space="preserve">’</w:t>
+      </w:r>
+      <w:r>
+        <w:rPr>
+          <w:b/>
+        </w:rPr>
+        <w:t xml:space="preserve">.</w:t>
+      </w:r>
+      <w:r>
+        <w:rPr>
+          <w:b/>
+        </w:rPr>
+        <w:t xml:space="preserve">”</w:t>
+      </w:r>
+      <w:r>
+        <w:t xml:space="preserve"> </w:t>
+      </w:r>
+      <w:r>
+        <w:t xml:space="preserve">Install PyYAML (</w:t>
+      </w:r>
+      <w:r>
+        <w:rPr>
+          <w:rStyle w:val="VerbatimChar"/>
+        </w:rPr>
+        <w:t xml:space="preserve">pip install pyyaml</w:t>
+      </w:r>
+      <w:r>
+        <w:t xml:space="preserve">, or</w:t>
+      </w:r>
+      <w:r>
+        <w:t xml:space="preserve"> </w:t>
+      </w:r>
+      <w:r>
+        <w:rPr>
+          <w:rStyle w:val="VerbatimChar"/>
+        </w:rPr>
+        <w:t xml:space="preserve">python tasks.py setup</w:t>
+      </w:r>
+      <w:r>
+        <w:t xml:space="preserve">). The spec-reading skills need it.</w:t>
       </w:r>
     </w:p>
     <w:p>
@@ -7228,34 +7595,59 @@
         <w:rPr>
           <w:b/>
         </w:rPr>
-        <w:t xml:space="preserve">Close the loop</w:t>
-      </w:r>
-      <w:r>
-        <w:t xml:space="preserve">: run the relevant gate (DQ, verify, readiness) before calling it done.</w:t>
-      </w:r>
-    </w:p>
-    <w:p>
-      <w:r>
-        <w:pict>
-          <v:rect style="width:0;height:1.5pt" o:hralign="center" o:hrstd="t" o:hr="t"/>
-        </w:pict>
-      </w:r>
-    </w:p>
-    <w:p>
-      <w:pPr>
-        <w:pStyle w:val="Heading2"/>
-      </w:pPr>
-      <w:bookmarkStart w:id="41" w:name="troubleshooting-faq"/>
-      <w:r>
-        <w:t xml:space="preserve">10. Troubleshooting &amp; FAQ</w:t>
-      </w:r>
-      <w:bookmarkEnd w:id="41"/>
+        <w:t xml:space="preserve">“</w:t>
+      </w:r>
+      <w:r>
+        <w:rPr>
+          <w:b/>
+        </w:rPr>
+        <w:t xml:space="preserve">The accuracy DQ test passes but we never wrote the reconciliation.</w:t>
+      </w:r>
+      <w:r>
+        <w:rPr>
+          <w:b/>
+        </w:rPr>
+        <w:t xml:space="preserve">”</w:t>
+      </w:r>
+      <w:r>
+        <w:t xml:space="preserve"> </w:t>
+      </w:r>
+      <w:r>
+        <w:t xml:space="preserve">That’s the deliberate</w:t>
+      </w:r>
+      <w:r>
+        <w:t xml:space="preserve"> </w:t>
+      </w:r>
+      <w:r>
+        <w:t xml:space="preserve">stub — accuracy is an</w:t>
+      </w:r>
+      <w:r>
+        <w:t xml:space="preserve"> </w:t>
+      </w:r>
+      <w:r>
+        <w:rPr>
+          <w:b/>
+        </w:rPr>
+        <w:t xml:space="preserve">open control</w:t>
+      </w:r>
+      <w:r>
+        <w:t xml:space="preserve"> </w:t>
+      </w:r>
+      <w:r>
+        <w:t xml:space="preserve">until you implement the real cross-source check; don’t read</w:t>
+      </w:r>
+      <w:r>
+        <w:t xml:space="preserve"> </w:t>
+      </w:r>
+      <w:r>
+        <w:t xml:space="preserve">the green as done.</w:t>
+      </w:r>
     </w:p>
     <w:p>
       <w:pPr>
         <w:numPr>
           <w:ilvl w:val="0"/>
-          <w:numId w:val="1030"/>
+          <w:numId w:val="1029"/>
         </w:numPr>
         <w:pStyle w:val="Compact"/>
       </w:pPr>
@@ -7269,7 +7661,7 @@
         <w:rPr>
           <w:b/>
         </w:rPr>
-        <w:t xml:space="preserve">dbt didn’t run in Cowork.</w:t>
+        <w:t xml:space="preserve">A description is unclear.</w:t>
       </w:r>
       <w:r>
         <w:rPr>
@@ -7281,426 +7673,35 @@
         <w:t xml:space="preserve"> </w:t>
       </w:r>
       <w:r>
-        <w:t xml:space="preserve">Correct — that’s Track B. Cowork</w:t>
-      </w:r>
-      <w:r>
-        <w:t xml:space="preserve"> </w:t>
-      </w:r>
-      <w:r>
-        <w:rPr>
-          <w:i/>
-        </w:rPr>
-        <w:t xml:space="preserve">generates</w:t>
-      </w:r>
-      <w:r>
-        <w:t xml:space="preserve"> </w:t>
-      </w:r>
-      <w:r>
-        <w:t xml:space="preserve">the models; you run</w:t>
-      </w:r>
-      <w:r>
-        <w:t xml:space="preserve"> </w:t>
-      </w:r>
-      <w:r>
-        <w:rPr>
-          <w:rStyle w:val="VerbatimChar"/>
-        </w:rPr>
-        <w:t xml:space="preserve">dbt build</w:t>
-      </w:r>
-      <w:r>
-        <w:t xml:space="preserve"> </w:t>
-      </w:r>
-      <w:r>
-        <w:t xml:space="preserve">on your workstation/stack. (</w:t>
-      </w:r>
-      <w:r>
-        <w:rPr>
-          <w:rStyle w:val="VerbatimChar"/>
-        </w:rPr>
-        <w:t xml:space="preserve">mtca-dev-workflow</w:t>
-      </w:r>
-      <w:r>
-        <w:t xml:space="preserve">.)</w:t>
+        <w:t xml:space="preserve">Mark it</w:t>
+      </w:r>
+      <w:r>
+        <w:t xml:space="preserve"> </w:t>
+      </w:r>
+      <w:r>
+        <w:rPr>
+          <w:rStyle w:val="VerbatimChar"/>
+        </w:rPr>
+        <w:t xml:space="preserve">to_confirm</w:t>
+      </w:r>
+      <w:r>
+        <w:t xml:space="preserve"> </w:t>
+      </w:r>
+      <w:r>
+        <w:t xml:space="preserve">(not a guess) and resolve it with the Data</w:t>
+      </w:r>
+      <w:r>
+        <w:t xml:space="preserve"> </w:t>
+      </w:r>
+      <w:r>
+        <w:t xml:space="preserve">Owner; the verify gate keeps DRAFT meaning out of marts.</w:t>
       </w:r>
     </w:p>
     <w:p>
       <w:pPr>
         <w:numPr>
           <w:ilvl w:val="0"/>
-          <w:numId w:val="1030"/>
-        </w:numPr>
-        <w:pStyle w:val="Compact"/>
-      </w:pPr>
-      <w:r>
-        <w:rPr>
-          <w:b/>
-        </w:rPr>
-        <w:t xml:space="preserve">“</w:t>
-      </w:r>
-      <w:r>
-        <w:rPr>
-          <w:b/>
-        </w:rPr>
-        <w:t xml:space="preserve">git says</w:t>
-      </w:r>
-      <w:r>
-        <w:rPr>
-          <w:b/>
-        </w:rPr>
-        <w:t xml:space="preserve"> </w:t>
-      </w:r>
-      <w:r>
-        <w:rPr>
-          <w:rStyle w:val="VerbatimChar"/>
-          <w:b/>
-        </w:rPr>
-        <w:t xml:space="preserve">index.lock</w:t>
-      </w:r>
-      <w:r>
-        <w:rPr>
-          <w:b/>
-        </w:rPr>
-        <w:t xml:space="preserve"> </w:t>
-      </w:r>
-      <w:r>
-        <w:rPr>
-          <w:b/>
-        </w:rPr>
-        <w:t xml:space="preserve">exists / can’t commit.</w:t>
-      </w:r>
-      <w:r>
-        <w:rPr>
-          <w:b/>
-        </w:rPr>
-        <w:t xml:space="preserve">”</w:t>
-      </w:r>
-      <w:r>
-        <w:t xml:space="preserve"> </w:t>
-      </w:r>
-      <w:r>
-        <w:t xml:space="preserve">A git command was run inside the Cowork sandbox,</w:t>
-      </w:r>
-      <w:r>
-        <w:t xml:space="preserve"> </w:t>
-      </w:r>
-      <w:r>
-        <w:t xml:space="preserve">which can’t clean up its lock files. Run git</w:t>
-      </w:r>
-      <w:r>
-        <w:t xml:space="preserve"> </w:t>
-      </w:r>
-      <w:r>
-        <w:rPr>
-          <w:b/>
-        </w:rPr>
-        <w:t xml:space="preserve">on your workstation</w:t>
-      </w:r>
-      <w:r>
-        <w:t xml:space="preserve">; if locks are stranded, delete</w:t>
-      </w:r>
-      <w:r>
-        <w:t xml:space="preserve"> </w:t>
-      </w:r>
-      <w:r>
-        <w:rPr>
-          <w:rStyle w:val="VerbatimChar"/>
-        </w:rPr>
-        <w:t xml:space="preserve">.git/index.lock</w:t>
-      </w:r>
-      <w:r>
-        <w:t xml:space="preserve"> </w:t>
-      </w:r>
-      <w:r>
-        <w:t xml:space="preserve">(see</w:t>
-      </w:r>
-      <w:r>
-        <w:t xml:space="preserve"> </w:t>
-      </w:r>
-      <w:r>
-        <w:rPr>
-          <w:rStyle w:val="VerbatimChar"/>
-        </w:rPr>
-        <w:t xml:space="preserve">repo-scaffold/references/git-on-the-workstation.md</w:t>
-      </w:r>
-      <w:r>
-        <w:t xml:space="preserve">).</w:t>
-      </w:r>
-    </w:p>
-    <w:p>
-      <w:pPr>
-        <w:numPr>
-          <w:ilvl w:val="0"/>
-          <w:numId w:val="1030"/>
-        </w:numPr>
-        <w:pStyle w:val="Compact"/>
-      </w:pPr>
-      <w:r>
-        <w:rPr>
-          <w:b/>
-        </w:rPr>
-        <w:t xml:space="preserve">“</w:t>
-      </w:r>
-      <w:r>
-        <w:rPr>
-          <w:b/>
-        </w:rPr>
-        <w:t xml:space="preserve">The script left files inside the skill folder.</w:t>
-      </w:r>
-      <w:r>
-        <w:rPr>
-          <w:b/>
-        </w:rPr>
-        <w:t xml:space="preserve">”</w:t>
-      </w:r>
-      <w:r>
-        <w:t xml:space="preserve"> </w:t>
-      </w:r>
-      <w:r>
-        <w:t xml:space="preserve">Point</w:t>
-      </w:r>
-      <w:r>
-        <w:t xml:space="preserve"> </w:t>
-      </w:r>
-      <w:r>
-        <w:rPr>
-          <w:rStyle w:val="VerbatimChar"/>
-        </w:rPr>
-        <w:t xml:space="preserve">--out</w:t>
-      </w:r>
-      <w:r>
-        <w:t xml:space="preserve">/</w:t>
-      </w:r>
-      <w:r>
-        <w:rPr>
-          <w:rStyle w:val="VerbatimChar"/>
-        </w:rPr>
-        <w:t xml:space="preserve">--repo</w:t>
-      </w:r>
-      <w:r>
-        <w:t xml:space="preserve"> </w:t>
-      </w:r>
-      <w:r>
-        <w:t xml:space="preserve">at your repo’s workspace</w:t>
-      </w:r>
-      <w:r>
-        <w:t xml:space="preserve"> </w:t>
-      </w:r>
-      <w:r>
-        <w:t xml:space="preserve">(e.g. </w:t>
-      </w:r>
-      <w:r>
-        <w:rPr>
-          <w:rStyle w:val="VerbatimChar"/>
-        </w:rPr>
-        <w:t xml:space="preserve">catalogue/module-semantics/</w:t>
-      </w:r>
-      <w:r>
-        <w:t xml:space="preserve">), not the skill directory.</w:t>
-      </w:r>
-    </w:p>
-    <w:p>
-      <w:pPr>
-        <w:numPr>
-          <w:ilvl w:val="0"/>
-          <w:numId w:val="1030"/>
-        </w:numPr>
-        <w:pStyle w:val="Compact"/>
-      </w:pPr>
-      <w:r>
-        <w:rPr>
-          <w:b/>
-        </w:rPr>
-        <w:t xml:space="preserve">“</w:t>
-      </w:r>
-      <w:r>
-        <w:rPr>
-          <w:b/>
-        </w:rPr>
-        <w:t xml:space="preserve">A YAML-spec skill says</w:t>
-      </w:r>
-      <w:r>
-        <w:rPr>
-          <w:b/>
-        </w:rPr>
-        <w:t xml:space="preserve"> </w:t>
-      </w:r>
-      <w:r>
-        <w:rPr>
-          <w:b/>
-        </w:rPr>
-        <w:t xml:space="preserve">‘</w:t>
-      </w:r>
-      <w:r>
-        <w:rPr>
-          <w:b/>
-        </w:rPr>
-        <w:t xml:space="preserve">install pyyaml</w:t>
-      </w:r>
-      <w:r>
-        <w:rPr>
-          <w:b/>
-        </w:rPr>
-        <w:t xml:space="preserve">’</w:t>
-      </w:r>
-      <w:r>
-        <w:rPr>
-          <w:b/>
-        </w:rPr>
-        <w:t xml:space="preserve">.</w:t>
-      </w:r>
-      <w:r>
-        <w:rPr>
-          <w:b/>
-        </w:rPr>
-        <w:t xml:space="preserve">”</w:t>
-      </w:r>
-      <w:r>
-        <w:t xml:space="preserve"> </w:t>
-      </w:r>
-      <w:r>
-        <w:t xml:space="preserve">Install PyYAML (</w:t>
-      </w:r>
-      <w:r>
-        <w:rPr>
-          <w:rStyle w:val="VerbatimChar"/>
-        </w:rPr>
-        <w:t xml:space="preserve">pip install pyyaml</w:t>
-      </w:r>
-      <w:r>
-        <w:t xml:space="preserve">, or</w:t>
-      </w:r>
-      <w:r>
-        <w:t xml:space="preserve"> </w:t>
-      </w:r>
-      <w:r>
-        <w:rPr>
-          <w:rStyle w:val="VerbatimChar"/>
-        </w:rPr>
-        <w:t xml:space="preserve">python tasks.py setup</w:t>
-      </w:r>
-      <w:r>
-        <w:t xml:space="preserve">). The spec-reading skills need it.</w:t>
-      </w:r>
-    </w:p>
-    <w:p>
-      <w:pPr>
-        <w:numPr>
-          <w:ilvl w:val="0"/>
-          <w:numId w:val="1030"/>
-        </w:numPr>
-        <w:pStyle w:val="Compact"/>
-      </w:pPr>
-      <w:r>
-        <w:rPr>
-          <w:b/>
-        </w:rPr>
-        <w:t xml:space="preserve">“</w:t>
-      </w:r>
-      <w:r>
-        <w:rPr>
-          <w:b/>
-        </w:rPr>
-        <w:t xml:space="preserve">The accuracy DQ test passes but we never wrote the reconciliation.</w:t>
-      </w:r>
-      <w:r>
-        <w:rPr>
-          <w:b/>
-        </w:rPr>
-        <w:t xml:space="preserve">”</w:t>
-      </w:r>
-      <w:r>
-        <w:t xml:space="preserve"> </w:t>
-      </w:r>
-      <w:r>
-        <w:t xml:space="preserve">That’s the deliberate</w:t>
-      </w:r>
-      <w:r>
-        <w:t xml:space="preserve"> </w:t>
-      </w:r>
-      <w:r>
-        <w:t xml:space="preserve">stub — accuracy is an</w:t>
-      </w:r>
-      <w:r>
-        <w:t xml:space="preserve"> </w:t>
-      </w:r>
-      <w:r>
-        <w:rPr>
-          <w:b/>
-        </w:rPr>
-        <w:t xml:space="preserve">open control</w:t>
-      </w:r>
-      <w:r>
-        <w:t xml:space="preserve"> </w:t>
-      </w:r>
-      <w:r>
-        <w:t xml:space="preserve">until you implement the real cross-source check; don’t read</w:t>
-      </w:r>
-      <w:r>
-        <w:t xml:space="preserve"> </w:t>
-      </w:r>
-      <w:r>
-        <w:t xml:space="preserve">the green as done.</w:t>
-      </w:r>
-    </w:p>
-    <w:p>
-      <w:pPr>
-        <w:numPr>
-          <w:ilvl w:val="0"/>
-          <w:numId w:val="1030"/>
-        </w:numPr>
-        <w:pStyle w:val="Compact"/>
-      </w:pPr>
-      <w:r>
-        <w:rPr>
-          <w:b/>
-        </w:rPr>
-        <w:t xml:space="preserve">“</w:t>
-      </w:r>
-      <w:r>
-        <w:rPr>
-          <w:b/>
-        </w:rPr>
-        <w:t xml:space="preserve">A description is unclear.</w:t>
-      </w:r>
-      <w:r>
-        <w:rPr>
-          <w:b/>
-        </w:rPr>
-        <w:t xml:space="preserve">”</w:t>
-      </w:r>
-      <w:r>
-        <w:t xml:space="preserve"> </w:t>
-      </w:r>
-      <w:r>
-        <w:t xml:space="preserve">Mark it</w:t>
-      </w:r>
-      <w:r>
-        <w:t xml:space="preserve"> </w:t>
-      </w:r>
-      <w:r>
-        <w:rPr>
-          <w:rStyle w:val="VerbatimChar"/>
-        </w:rPr>
-        <w:t xml:space="preserve">to_confirm</w:t>
-      </w:r>
-      <w:r>
-        <w:t xml:space="preserve"> </w:t>
-      </w:r>
-      <w:r>
-        <w:t xml:space="preserve">(not a guess) and resolve it with the Data</w:t>
-      </w:r>
-      <w:r>
-        <w:t xml:space="preserve"> </w:t>
-      </w:r>
-      <w:r>
-        <w:t xml:space="preserve">Owner; the verify gate keeps DRAFT meaning out of marts.</w:t>
-      </w:r>
-    </w:p>
-    <w:p>
-      <w:pPr>
-        <w:numPr>
-          <w:ilvl w:val="0"/>
-          <w:numId w:val="1030"/>
+          <w:numId w:val="1029"/>
         </w:numPr>
         <w:pStyle w:val="Compact"/>
       </w:pPr>
@@ -8212,7 +8213,7 @@
       <w:pPr>
         <w:numPr>
           <w:ilvl w:val="0"/>
-          <w:numId w:val="1031"/>
+          <w:numId w:val="1030"/>
         </w:numPr>
         <w:pStyle w:val="Compact"/>
       </w:pPr>
@@ -8248,7 +8249,7 @@
       <w:pPr>
         <w:numPr>
           <w:ilvl w:val="0"/>
-          <w:numId w:val="1031"/>
+          <w:numId w:val="1030"/>
         </w:numPr>
         <w:pStyle w:val="Compact"/>
       </w:pPr>
@@ -8269,7 +8270,7 @@
       <w:pPr>
         <w:numPr>
           <w:ilvl w:val="0"/>
-          <w:numId w:val="1031"/>
+          <w:numId w:val="1030"/>
         </w:numPr>
         <w:pStyle w:val="Compact"/>
       </w:pPr>
@@ -8290,7 +8291,7 @@
       <w:pPr>
         <w:numPr>
           <w:ilvl w:val="0"/>
-          <w:numId w:val="1031"/>
+          <w:numId w:val="1030"/>
         </w:numPr>
         <w:pStyle w:val="Compact"/>
       </w:pPr>
@@ -8994,9 +8995,6 @@
     <w:abstractNumId w:val="991"/>
   </w:num>
   <w:num w:numId="1030">
-    <w:abstractNumId w:val="991"/>
-  </w:num>
-  <w:num w:numId="1031">
     <w:abstractNumId w:val="991"/>
   </w:num>
 </w:numbering>

</xml_diff>